<commit_message>
Update Q1.5 bucket boundaries list and sync reports
</commit_message>
<xml_diff>
--- a/A1/reports/Assignment_Report.docx
+++ b/A1/reports/Assignment_Report.docx
@@ -265,7 +265,7 @@
     </w:p>
     <w:p>
       <w:r>
-        <w:t>To inspect PostgreSQL internal statistics and histogram boundary values stored in pgstats:</w:t>
+        <w:t>To inspect PostgreSQL internal statistics and histogram boundary values stored in pgstats (and exported in /tmp/stats.csv):</w:t>
       </w:r>
     </w:p>
     <w:p>
@@ -275,7 +275,37 @@
     </w:p>
     <w:p>
       <w:r>
-        <w:t>SELECT tablename, attname, nullfrac, avgwidth, ndistinct, histogrambounds</w:t>
+        <w:t>SELECT</w:t>
+      </w:r>
+    </w:p>
+    <w:p>
+      <w:r>
+        <w:t>attname,</w:t>
+      </w:r>
+    </w:p>
+    <w:p>
+      <w:r>
+        <w:t>nullfrac,</w:t>
+      </w:r>
+    </w:p>
+    <w:p>
+      <w:r>
+        <w:t>ndistinct,</w:t>
+      </w:r>
+    </w:p>
+    <w:p>
+      <w:r>
+        <w:t>mostcommonvals,</w:t>
+      </w:r>
+    </w:p>
+    <w:p>
+      <w:r>
+        <w:t>mostcommonfreqs,</w:t>
+      </w:r>
+    </w:p>
+    <w:p>
+      <w:r>
+        <w:t>histogrambounds</w:t>
       </w:r>
     </w:p>
     <w:p>
@@ -285,7 +315,12 @@
     </w:p>
     <w:p>
       <w:r>
-        <w:t>WHERE tablename = 'title' AND attname IN ('id', 'title');</w:t>
+        <w:t>WHERE tablename = 'title'</w:t>
+      </w:r>
+    </w:p>
+    <w:p>
+      <w:r>
+        <w:t>AND attname IN ('id', 'title');</w:t>
       </w:r>
     </w:p>
     <w:p/>
@@ -364,23 +399,1047 @@
         <w:pStyle w:val="Heading3"/>
       </w:pPr>
       <w:r>
-        <w:t>5. Bucket Boundaries Summary</w:t>
-      </w:r>
-    </w:p>
-    <w:p>
-      <w:pPr>
-        <w:pStyle w:val="ListBullet"/>
-      </w:pPr>
-      <w:r>
-        <w:t>**`id` Column Boundaries**: Starts at `1` and ends at `2528312` across 100 equi-depth quantiles.</w:t>
-      </w:r>
-    </w:p>
-    <w:p>
-      <w:pPr>
-        <w:pStyle w:val="ListBullet"/>
-      </w:pPr>
-      <w:r>
-        <w:t>**`title` Column Boundaries**: Sample string boundaries range lexicographically from initial titles up to final lexicographical titles.</w:t>
+        <w:t>5. Exact Bucket Boundaries List (From `pg_stats` / `/tmp/stats.csv`)</w:t>
+      </w:r>
+    </w:p>
+    <w:p>
+      <w:r>
+        <w:t>#### A. Column id Bucket Boundaries (101 values, 100 buckets)</w:t>
+      </w:r>
+    </w:p>
+    <w:p>
+      <w:r>
+        <w:t>| Bucket Index | Boundary Value (id) | Bucket Interval |</w:t>
+      </w:r>
+    </w:p>
+    <w:p>
+      <w:r>
+        <w:t>| :---: | :---: | :--- |</w:t>
+      </w:r>
+    </w:p>
+    <w:p>
+      <w:r>
+        <w:t>| B000 (Start) | 41 | Start of table data |</w:t>
+      </w:r>
+    </w:p>
+    <w:p>
+      <w:r>
+        <w:t>| B001 | 25598 | Bucket 1: [41 - 25598] |</w:t>
+      </w:r>
+    </w:p>
+    <w:p>
+      <w:r>
+        <w:t>| B002 | 50067 | Bucket 2: [25598 - 50067] |</w:t>
+      </w:r>
+    </w:p>
+    <w:p>
+      <w:r>
+        <w:t>| B003 | 75257 | Bucket 3: [50067 - 75257] |</w:t>
+      </w:r>
+    </w:p>
+    <w:p>
+      <w:r>
+        <w:t>| B004 | 101946 | Bucket 4: [75257 - 101946] |</w:t>
+      </w:r>
+    </w:p>
+    <w:p>
+      <w:r>
+        <w:t>| B005 | 129223 | Bucket 5: [101946 - 129223] |</w:t>
+      </w:r>
+    </w:p>
+    <w:p>
+      <w:r>
+        <w:t>| B006 | 155973 | Bucket 6: [129223 - 155973] |</w:t>
+      </w:r>
+    </w:p>
+    <w:p>
+      <w:r>
+        <w:t>| B007 | 181990 | Bucket 7: [155973 - 181990] |</w:t>
+      </w:r>
+    </w:p>
+    <w:p>
+      <w:r>
+        <w:t>| B008 | 208153 | Bucket 8: [181990 - 208153] |</w:t>
+      </w:r>
+    </w:p>
+    <w:p>
+      <w:r>
+        <w:t>| B009 | 234525 | Bucket 9: [208153 - 234525] |</w:t>
+      </w:r>
+    </w:p>
+    <w:p>
+      <w:r>
+        <w:t>| B010 | 259507 | Bucket 10: [234525 - 259507] |</w:t>
+      </w:r>
+    </w:p>
+    <w:p>
+      <w:r>
+        <w:t>| B011 | 287845 | Bucket 11: [259507 - 287845] |</w:t>
+      </w:r>
+    </w:p>
+    <w:p>
+      <w:r>
+        <w:t>| B012 | 314618 | Bucket 12: [287845 - 314618] |</w:t>
+      </w:r>
+    </w:p>
+    <w:p>
+      <w:r>
+        <w:t>| B013 | 340479 | Bucket 13: [314618 - 340479] |</w:t>
+      </w:r>
+    </w:p>
+    <w:p>
+      <w:r>
+        <w:t>| B014 | 366364 | Bucket 14: [340479 - 366364] |</w:t>
+      </w:r>
+    </w:p>
+    <w:p>
+      <w:r>
+        <w:t>| B015 | 393076 | Bucket 15: [366364 - 393076] |</w:t>
+      </w:r>
+    </w:p>
+    <w:p>
+      <w:r>
+        <w:t>| B016 | 418929 | Bucket 16: [393076 - 418929] |</w:t>
+      </w:r>
+    </w:p>
+    <w:p>
+      <w:r>
+        <w:t>| B017 | 443204 | Bucket 17: [418929 - 443204] |</w:t>
+      </w:r>
+    </w:p>
+    <w:p>
+      <w:r>
+        <w:t>| B018 | 472539 | Bucket 18: [443204 - 472539] |</w:t>
+      </w:r>
+    </w:p>
+    <w:p>
+      <w:r>
+        <w:t>| B019 | 497095 | Bucket 19: [472539 - 497095] |</w:t>
+      </w:r>
+    </w:p>
+    <w:p>
+      <w:r>
+        <w:t>| B020 | 521015 | Bucket 20: [497095 - 521015] |</w:t>
+      </w:r>
+    </w:p>
+    <w:p>
+      <w:r>
+        <w:t>| B021 | 547008 | Bucket 21: [521015 - 547008] |</w:t>
+      </w:r>
+    </w:p>
+    <w:p>
+      <w:r>
+        <w:t>| B022 | 571914 | Bucket 22: [547008 - 571914] |</w:t>
+      </w:r>
+    </w:p>
+    <w:p>
+      <w:r>
+        <w:t>| B023 | 600124 | Bucket 23: [571914 - 600124] |</w:t>
+      </w:r>
+    </w:p>
+    <w:p>
+      <w:r>
+        <w:t>| B024 | 624290 | Bucket 24: [600124 - 624290] |</w:t>
+      </w:r>
+    </w:p>
+    <w:p>
+      <w:r>
+        <w:t>| B025 | 648346 | Bucket 25: [624290 - 648346] |</w:t>
+      </w:r>
+    </w:p>
+    <w:p>
+      <w:r>
+        <w:t>| B026 | 673077 | Bucket 26: [648346 - 673077] |</w:t>
+      </w:r>
+    </w:p>
+    <w:p>
+      <w:r>
+        <w:t>| B027 | 698192 | Bucket 27: [673077 - 698192] |</w:t>
+      </w:r>
+    </w:p>
+    <w:p>
+      <w:r>
+        <w:t>| B028 | 723945 | Bucket 28: [698192 - 723945] |</w:t>
+      </w:r>
+    </w:p>
+    <w:p>
+      <w:r>
+        <w:t>| B029 | 747971 | Bucket 29: [723945 - 747971] |</w:t>
+      </w:r>
+    </w:p>
+    <w:p>
+      <w:r>
+        <w:t>| B030 | 774715 | Bucket 30: [747971 - 774715] |</w:t>
+      </w:r>
+    </w:p>
+    <w:p>
+      <w:r>
+        <w:t>| B031 | 801886 | Bucket 31: [774715 - 801886] |</w:t>
+      </w:r>
+    </w:p>
+    <w:p>
+      <w:r>
+        <w:t>| B032 | 825206 | Bucket 32: [801886 - 825206] |</w:t>
+      </w:r>
+    </w:p>
+    <w:p>
+      <w:r>
+        <w:t>| B033 | 852044 | Bucket 33: [825206 - 852044] |</w:t>
+      </w:r>
+    </w:p>
+    <w:p>
+      <w:r>
+        <w:t>| B034 | 878630 | Bucket 34: [852044 - 878630] |</w:t>
+      </w:r>
+    </w:p>
+    <w:p>
+      <w:r>
+        <w:t>| B035 | 903227 | Bucket 35: [878630 - 903227] |</w:t>
+      </w:r>
+    </w:p>
+    <w:p>
+      <w:r>
+        <w:t>| B036 | 929542 | Bucket 36: [903227 - 929542] |</w:t>
+      </w:r>
+    </w:p>
+    <w:p>
+      <w:r>
+        <w:t>| B037 | 951992 | Bucket 37: [929542 - 951992] |</w:t>
+      </w:r>
+    </w:p>
+    <w:p>
+      <w:r>
+        <w:t>| B038 | 976177 | Bucket 38: [951992 - 976177] |</w:t>
+      </w:r>
+    </w:p>
+    <w:p>
+      <w:r>
+        <w:t>| B039 | 1002223 | Bucket 39: [976177 - 1002223] |</w:t>
+      </w:r>
+    </w:p>
+    <w:p>
+      <w:r>
+        <w:t>| B040 | 1027496 | Bucket 40: [1002223 - 1027496] |</w:t>
+      </w:r>
+    </w:p>
+    <w:p>
+      <w:r>
+        <w:t>| B041 | 1053013 | Bucket 41: [1027496 - 1053013] |</w:t>
+      </w:r>
+    </w:p>
+    <w:p>
+      <w:r>
+        <w:t>| B042 | 1076669 | Bucket 42: [1053013 - 1076669] |</w:t>
+      </w:r>
+    </w:p>
+    <w:p>
+      <w:r>
+        <w:t>| B043 | 1101644 | Bucket 43: [1076669 - 1101644] |</w:t>
+      </w:r>
+    </w:p>
+    <w:p>
+      <w:r>
+        <w:t>| B044 | 1127312 | Bucket 44: [1101644 - 1127312] |</w:t>
+      </w:r>
+    </w:p>
+    <w:p>
+      <w:r>
+        <w:t>| B045 | 1153408 | Bucket 45: [1127312 - 1153408] |</w:t>
+      </w:r>
+    </w:p>
+    <w:p>
+      <w:r>
+        <w:t>| B046 | 1177087 | Bucket 46: [1153408 - 1177087] |</w:t>
+      </w:r>
+    </w:p>
+    <w:p>
+      <w:r>
+        <w:t>| B047 | 1200809 | Bucket 47: [1177087 - 1200809] |</w:t>
+      </w:r>
+    </w:p>
+    <w:p>
+      <w:r>
+        <w:t>| B048 | 1228132 | Bucket 48: [1200809 - 1228132] |</w:t>
+      </w:r>
+    </w:p>
+    <w:p>
+      <w:r>
+        <w:t>| B049 | 1251987 | Bucket 49: [1228132 - 1251987] |</w:t>
+      </w:r>
+    </w:p>
+    <w:p>
+      <w:r>
+        <w:t>| B050 | 1276194 | Bucket 50: [1251987 - 1276194] |</w:t>
+      </w:r>
+    </w:p>
+    <w:p>
+      <w:r>
+        <w:t>| B051 | 1300208 | Bucket 51: [1276194 - 1300208] |</w:t>
+      </w:r>
+    </w:p>
+    <w:p>
+      <w:r>
+        <w:t>| B052 | 1325279 | Bucket 52: [1300208 - 1325279] |</w:t>
+      </w:r>
+    </w:p>
+    <w:p>
+      <w:r>
+        <w:t>| B053 | 1350079 | Bucket 53: [1325279 - 1350079] |</w:t>
+      </w:r>
+    </w:p>
+    <w:p>
+      <w:r>
+        <w:t>| B054 | 1375217 | Bucket 54: [1350079 - 1375217] |</w:t>
+      </w:r>
+    </w:p>
+    <w:p>
+      <w:r>
+        <w:t>| B055 | 1399305 | Bucket 55: [1375217 - 1399305] |</w:t>
+      </w:r>
+    </w:p>
+    <w:p>
+      <w:r>
+        <w:t>| B056 | 1424915 | Bucket 56: [1399305 - 1424915] |</w:t>
+      </w:r>
+    </w:p>
+    <w:p>
+      <w:r>
+        <w:t>| B057 | 1447763 | Bucket 57: [1424915 - 1447763] |</w:t>
+      </w:r>
+    </w:p>
+    <w:p>
+      <w:r>
+        <w:t>| B058 | 1472187 | Bucket 58: [1447763 - 1472187] |</w:t>
+      </w:r>
+    </w:p>
+    <w:p>
+      <w:r>
+        <w:t>| B059 | 1496066 | Bucket 59: [1472187 - 1496066] |</w:t>
+      </w:r>
+    </w:p>
+    <w:p>
+      <w:r>
+        <w:t>| B060 | 1520933 | Bucket 60: [1496066 - 1520933] |</w:t>
+      </w:r>
+    </w:p>
+    <w:p>
+      <w:r>
+        <w:t>| B061 | 1548374 | Bucket 61: [1520933 - 1548374] |</w:t>
+      </w:r>
+    </w:p>
+    <w:p>
+      <w:r>
+        <w:t>| B062 | 1572984 | Bucket 62: [1548374 - 1572984] |</w:t>
+      </w:r>
+    </w:p>
+    <w:p>
+      <w:r>
+        <w:t>| B063 | 1597331 | Bucket 63: [1572984 - 1597331] |</w:t>
+      </w:r>
+    </w:p>
+    <w:p>
+      <w:r>
+        <w:t>| B064 | 1621524 | Bucket 64: [1597331 - 1621524] |</w:t>
+      </w:r>
+    </w:p>
+    <w:p>
+      <w:r>
+        <w:t>| B065 | 1646529 | Bucket 65: [1621524 - 1646529] |</w:t>
+      </w:r>
+    </w:p>
+    <w:p>
+      <w:r>
+        <w:t>| B066 | 1671841 | Bucket 66: [1646529 - 1671841] |</w:t>
+      </w:r>
+    </w:p>
+    <w:p>
+      <w:r>
+        <w:t>| B067 | 1697305 | Bucket 67: [1671841 - 1697305] |</w:t>
+      </w:r>
+    </w:p>
+    <w:p>
+      <w:r>
+        <w:t>| B068 | 1720750 | Bucket 68: [1697305 - 1720750] |</w:t>
+      </w:r>
+    </w:p>
+    <w:p>
+      <w:r>
+        <w:t>| B069 | 1746578 | Bucket 69: [1720750 - 1746578] |</w:t>
+      </w:r>
+    </w:p>
+    <w:p>
+      <w:r>
+        <w:t>| B070 | 1771397 | Bucket 70: [1746578 - 1771397] |</w:t>
+      </w:r>
+    </w:p>
+    <w:p>
+      <w:r>
+        <w:t>| B071 | 1796312 | Bucket 71: [1771397 - 1796312] |</w:t>
+      </w:r>
+    </w:p>
+    <w:p>
+      <w:r>
+        <w:t>| B072 | 1821069 | Bucket 72: [1796312 - 1821069] |</w:t>
+      </w:r>
+    </w:p>
+    <w:p>
+      <w:r>
+        <w:t>| B073 | 1846620 | Bucket 73: [1821069 - 1846620] |</w:t>
+      </w:r>
+    </w:p>
+    <w:p>
+      <w:r>
+        <w:t>| B074 | 1871455 | Bucket 74: [1846620 - 1871455] |</w:t>
+      </w:r>
+    </w:p>
+    <w:p>
+      <w:r>
+        <w:t>| B075 | 1897069 | Bucket 75: [1871455 - 1897069] |</w:t>
+      </w:r>
+    </w:p>
+    <w:p>
+      <w:r>
+        <w:t>| B076 | 1923039 | Bucket 76: [1897069 - 1923039] |</w:t>
+      </w:r>
+    </w:p>
+    <w:p>
+      <w:r>
+        <w:t>| B077 | 1951619 | Bucket 77: [1923039 - 1951619] |</w:t>
+      </w:r>
+    </w:p>
+    <w:p>
+      <w:r>
+        <w:t>| B078 | 1975550 | Bucket 78: [1951619 - 1975550] |</w:t>
+      </w:r>
+    </w:p>
+    <w:p>
+      <w:r>
+        <w:t>| B079 | 2001398 | Bucket 79: [1975550 - 2001398] |</w:t>
+      </w:r>
+    </w:p>
+    <w:p>
+      <w:r>
+        <w:t>| B080 | 2025488 | Bucket 80: [2001398 - 2025488] |</w:t>
+      </w:r>
+    </w:p>
+    <w:p>
+      <w:r>
+        <w:t>| B081 | 2048645 | Bucket 81: [2025488 - 2048645] |</w:t>
+      </w:r>
+    </w:p>
+    <w:p>
+      <w:r>
+        <w:t>| B082 | 2075506 | Bucket 82: [2048645 - 2075506] |</w:t>
+      </w:r>
+    </w:p>
+    <w:p>
+      <w:r>
+        <w:t>| B083 | 2099704 | Bucket 83: [2075506 - 2099704] |</w:t>
+      </w:r>
+    </w:p>
+    <w:p>
+      <w:r>
+        <w:t>| B084 | 2124027 | Bucket 84: [2099704 - 2124027] |</w:t>
+      </w:r>
+    </w:p>
+    <w:p>
+      <w:r>
+        <w:t>| B085 | 2146547 | Bucket 85: [2124027 - 2146547] |</w:t>
+      </w:r>
+    </w:p>
+    <w:p>
+      <w:r>
+        <w:t>| B086 | 2170970 | Bucket 86: [2146547 - 2170970] |</w:t>
+      </w:r>
+    </w:p>
+    <w:p>
+      <w:r>
+        <w:t>| B087 | 2195637 | Bucket 87: [2170970 - 2195637] |</w:t>
+      </w:r>
+    </w:p>
+    <w:p>
+      <w:r>
+        <w:t>| B088 | 2221366 | Bucket 88: [2195637 - 2221366] |</w:t>
+      </w:r>
+    </w:p>
+    <w:p>
+      <w:r>
+        <w:t>| B089 | 2249864 | Bucket 89: [2221366 - 2249864] |</w:t>
+      </w:r>
+    </w:p>
+    <w:p>
+      <w:r>
+        <w:t>| B090 | 2274023 | Bucket 90: [2249864 - 2274023] |</w:t>
+      </w:r>
+    </w:p>
+    <w:p>
+      <w:r>
+        <w:t>| B091 | 2299152 | Bucket 91: [2274023 - 2299152] |</w:t>
+      </w:r>
+    </w:p>
+    <w:p>
+      <w:r>
+        <w:t>| B092 | 2325178 | Bucket 92: [2299152 - 2325178] |</w:t>
+      </w:r>
+    </w:p>
+    <w:p>
+      <w:r>
+        <w:t>| B093 | 2352562 | Bucket 93: [2325178 - 2352562] |</w:t>
+      </w:r>
+    </w:p>
+    <w:p>
+      <w:r>
+        <w:t>| B094 | 2378000 | Bucket 94: [2352562 - 2378000] |</w:t>
+      </w:r>
+    </w:p>
+    <w:p>
+      <w:r>
+        <w:t>| B095 | 2403761 | Bucket 95: [2378000 - 2403761] |</w:t>
+      </w:r>
+    </w:p>
+    <w:p>
+      <w:r>
+        <w:t>| B096 | 2428038 | Bucket 96: [2403761 - 2428038] |</w:t>
+      </w:r>
+    </w:p>
+    <w:p>
+      <w:r>
+        <w:t>| B097 | 2452338 | Bucket 97: [2428038 - 2452338] |</w:t>
+      </w:r>
+    </w:p>
+    <w:p>
+      <w:r>
+        <w:t>| B098 | 2479928 | Bucket 98: [2452338 - 2479928] |</w:t>
+      </w:r>
+    </w:p>
+    <w:p>
+      <w:r>
+        <w:t>| B099 | 2505988 | Bucket 99: [2479928 - 2505988] |</w:t>
+      </w:r>
+    </w:p>
+    <w:p>
+      <w:r>
+        <w:t>| B100 | 2528305 | Bucket 100: [2505988 - 2528305] |</w:t>
+      </w:r>
+    </w:p>
+    <w:p>
+      <w:r>
+        <w:t>#### B. Column title Bucket Boundaries (101 values, 100 buckets)</w:t>
+      </w:r>
+    </w:p>
+    <w:p>
+      <w:r>
+        <w:t>| Bucket Index | Boundary Value (title) | Lexicographical Interval |</w:t>
+      </w:r>
+    </w:p>
+    <w:p>
+      <w:r>
+        <w:t>| :---: | :--- | :--- |</w:t>
+      </w:r>
+    </w:p>
+    <w:p>
+      <w:r>
+        <w:t>| B000 (Start) | ... | Start of text data |</w:t>
+      </w:r>
+    </w:p>
+    <w:p>
+      <w:r>
+        <w:t>| B001 | (#1.1302) | Bucket 1: [... - (#1.1302)] |</w:t>
+      </w:r>
+    </w:p>
+    <w:p>
+      <w:r>
+        <w:t>| B002 | (#1.219) | Bucket 2: [(#1.1302) - (#1.219)] |</w:t>
+      </w:r>
+    </w:p>
+    <w:p>
+      <w:r>
+        <w:t>| B003 | (#1.3662) | Bucket 3: [(#1.219) - (#1.3662)] |</w:t>
+      </w:r>
+    </w:p>
+    <w:p>
+      <w:r>
+        <w:t>| B004 | (#1.59) | Bucket 4: [(#1.3662) - (#1.59)] |</w:t>
+      </w:r>
+    </w:p>
+    <w:p>
+      <w:r>
+        <w:t>| B005 | (#1.846) | Bucket 5: [(#1.59) - (#1.846)] |</w:t>
+      </w:r>
+    </w:p>
+    <w:p>
+      <w:r>
+        <w:t>| B006 | (1968-02-14) | Bucket 6: [(#1.846) - (1968-02-14)] |</w:t>
+      </w:r>
+    </w:p>
+    <w:p>
+      <w:r>
+        <w:t>| B007 | (1982-12-14) | Bucket 7: [(1968-02-14) - (1982-12-14)] |</w:t>
+      </w:r>
+    </w:p>
+    <w:p>
+      <w:r>
+        <w:t>| B008 | (1994-07-07) | Bucket 8: [(1982-12-14) - (1994-07-07)] |</w:t>
+      </w:r>
+    </w:p>
+    <w:p>
+      <w:r>
+        <w:t>| B009 | (1998-03-16) | Bucket 9: [(1994-07-07) - (1998-03-16)] |</w:t>
+      </w:r>
+    </w:p>
+    <w:p>
+      <w:r>
+        <w:t>| B010 | (2000-01-22) | Bucket 10: [(1998-03-16) - (2000-01-22)] |</w:t>
+      </w:r>
+    </w:p>
+    <w:p>
+      <w:r>
+        <w:t>| B011 | (2001-11-06) | Bucket 11: [(2000-01-22) - (2001-11-06)] |</w:t>
+      </w:r>
+    </w:p>
+    <w:p>
+      <w:r>
+        <w:t>| B012 | (2003-08-29) | Bucket 12: [(2001-11-06) - (2003-08-29)] |</w:t>
+      </w:r>
+    </w:p>
+    <w:p>
+      <w:r>
+        <w:t>| B013 | (2005-01-19) | Bucket 13: [(2003-08-29) - (2005-01-19)] |</w:t>
+      </w:r>
+    </w:p>
+    <w:p>
+      <w:r>
+        <w:t>| B014 | (2006-05-17) | Bucket 14: [(2005-01-19) - (2006-05-17)] |</w:t>
+      </w:r>
+    </w:p>
+    <w:p>
+      <w:r>
+        <w:t>| B015 | (2007-07-05) | Bucket 15: [(2006-05-17) - (2007-07-05)] |</w:t>
+      </w:r>
+    </w:p>
+    <w:p>
+      <w:r>
+        <w:t>| B016 | (2009-02-02) | Bucket 16: [(2007-07-05) - (2009-02-02)] |</w:t>
+      </w:r>
+    </w:p>
+    <w:p>
+      <w:r>
+        <w:t>| B017 | (2010-09-07) | Bucket 17: [(2009-02-02) - (2010-09-07)] |</w:t>
+      </w:r>
+    </w:p>
+    <w:p>
+      <w:r>
+        <w:t>| B018 | (2011-08-29) | Bucket 18: [(2010-09-07) - (2011-08-29)] |</w:t>
+      </w:r>
+    </w:p>
+    <w:p>
+      <w:r>
+        <w:t>| B019 | (2012-07-21) | Bucket 19: [(2011-08-29) - (2012-07-21)] |</w:t>
+      </w:r>
+    </w:p>
+    <w:p>
+      <w:r>
+        <w:t>| B020 | (#20.140) | Bucket 20: [(2012-07-21) - (#20.140)] |</w:t>
+      </w:r>
+    </w:p>
+    <w:p>
+      <w:r>
+        <w:t>| B021 | (#2.92) | Bucket 21: [(#20.140) - (#2.92)] |</w:t>
+      </w:r>
+    </w:p>
+    <w:p>
+      <w:r>
+        <w:t>| B022 | (#4.172) | Bucket 22: [(#2.92) - (#4.172)] |</w:t>
+      </w:r>
+    </w:p>
+    <w:p>
+      <w:r>
+        <w:t>| B023 | (#6.163) | Bucket 23: [(#4.172) - (#6.163)] |</w:t>
+      </w:r>
+    </w:p>
+    <w:p>
+      <w:r>
+        <w:t>| B024 | Aamu joutuu pesemään tekojensa jälkipyykkiä | Bucket 24: [(#6.163) - Aamu joutuu pesemään tekojensa jälkipyykkiä] |</w:t>
+      </w:r>
+    </w:p>
+    <w:p>
+      <w:r>
+        <w:t>| B025 | Aflevering 2559 | Bucket 25: [Aamu joutuu pesemään tekojensa jälkipyykkiä - Aflevering 2559] |</w:t>
+      </w:r>
+    </w:p>
+    <w:p>
+      <w:r>
+        <w:t>| B026 | A Little Trip | Bucket 26: [Aflevering 2559 - A Little Trip] |</w:t>
+      </w:r>
+    </w:p>
+    <w:p>
+      <w:r>
+        <w:t>| B027 | An Atheist Named Faith | Bucket 27: [A Little Trip - An Atheist Named Faith] |</w:t>
+      </w:r>
+    </w:p>
+    <w:p>
+      <w:r>
+        <w:t>| B028 | Arabeskebi Pirosmanis temaze | Bucket 28: [An Atheist Named Faith - Arabeskebi Pirosmanis temaze] |</w:t>
+      </w:r>
+    </w:p>
+    <w:p>
+      <w:r>
+        <w:t>| B029 | Attenborough's Ark: Natural World Special | Bucket 29: [Arabeskebi Pirosmanis temaze - Attenborough's Ark: Natural World Special] |</w:t>
+      </w:r>
+    </w:p>
+    <w:p>
+      <w:r>
+        <w:t>| B030 | Baldur Blauzahn | Bucket 30: [Attenborough's Ark: Natural World Special - Baldur Blauzahn] |</w:t>
+      </w:r>
+    </w:p>
+    <w:p>
+      <w:r>
+        <w:t>| B031 | Best in Show Cakes | Bucket 31: [Baldur Blauzahn - Best in Show Cakes] |</w:t>
+      </w:r>
+    </w:p>
+    <w:p>
+      <w:r>
+        <w:t>| B032 | Blues | Bucket 32: [Best in Show Cakes - Blues] |</w:t>
+      </w:r>
+    </w:p>
+    <w:p>
+      <w:r>
+        <w:t>| B033 | Brown Before Green | Bucket 33: [Blues - Brown Before Green] |</w:t>
+      </w:r>
+    </w:p>
+    <w:p>
+      <w:r>
+        <w:t>| B034 | Captive Audience | Bucket 34: [Brown Before Green - Captive Audience] |</w:t>
+      </w:r>
+    </w:p>
+    <w:p>
+      <w:r>
+        <w:t>| B035 | Cheryl Cole's Night In | Bucket 35: [Captive Audience - Cheryl Cole's Night In] |</w:t>
+      </w:r>
+    </w:p>
+    <w:p>
+      <w:r>
+        <w:t>| B036 | Cobra Starship | Bucket 36: [Cheryl Cole's Night In - Cobra Starship] |</w:t>
+      </w:r>
+    </w:p>
+    <w:p>
+      <w:r>
+        <w:t>| B037 | CPM 22 e Babado Novo | Bucket 37: [Cobra Starship - CPM 22 e Babado Novo] |</w:t>
+      </w:r>
+    </w:p>
+    <w:p>
+      <w:r>
+        <w:t>| B038 | Dark Moon | Bucket 38: [CPM 22 e Babado Novo - Dark Moon] |</w:t>
+      </w:r>
+    </w:p>
+    <w:p>
+      <w:r>
+        <w:t>| B039 | De intrede van de Sint - Antwerpen 2011 | Bucket 39: [Dark Moon - De intrede van de Sint - Antwerpen 2011] |</w:t>
+      </w:r>
+    </w:p>
+    <w:p>
+      <w:r>
+        <w:t>| B040 | Det' politiet: Part 2 | Bucket 40: [De intrede van de Sint - Antwerpen 2011 - Det' politiet: Part 2] |</w:t>
+      </w:r>
+    </w:p>
+    <w:p>
+      <w:r>
+        <w:t>| B041 | DIY Network Holiday Celebration | Bucket 41: [Det' politiet: Part 2 - DIY Network Holiday Celebration] |</w:t>
+      </w:r>
+    </w:p>
+    <w:p>
+      <w:r>
+        <w:t>| B042 | Drugog puta nema! | Bucket 42: [DIY Network Holiday Celebration - Drugog puta nema!] |</w:t>
+      </w:r>
+    </w:p>
+    <w:p>
+      <w:r>
+        <w:t>| B043 | Elements | Bucket 43: [Drugog puta nema! - Elements] |</w:t>
+      </w:r>
+    </w:p>
+    <w:p>
+      <w:r>
+        <w:t>| B044 | Episode V - Tag der Abrechnung | Bucket 44: [Elements - Episode V - Tag der Abrechnung] |</w:t>
+      </w:r>
+    </w:p>
+    <w:p>
+      <w:r>
+        <w:t>| B045 | Famiresu tenshi purin | Bucket 45: [Episode V - Tag der Abrechnung - Famiresu tenshi purin] |</w:t>
+      </w:r>
+    </w:p>
+    <w:p>
+      <w:r>
+        <w:t>| B046 | Fleshdance | Bucket 46: [Famiresu tenshi purin - Fleshdance] |</w:t>
+      </w:r>
+    </w:p>
+    <w:p>
+      <w:r>
+        <w:t>| B047 | Fuga y misterio | Bucket 47: [Fleshdance - Fuga y misterio] |</w:t>
+      </w:r>
+    </w:p>
+    <w:p>
+      <w:r>
+        <w:t>| B048 | Girls' Generation and the Dangerous Boys | Bucket 48: [Fuga y misterio - Girls' Generation and the Dangerous Boys] |</w:t>
+      </w:r>
+    </w:p>
+    <w:p>
+      <w:r>
+        <w:t>| B049 | Guadalcanal/Leckie | Bucket 49: [Girls' Generation and the Dangerous Boys - Guadalcanal/Leckie] |</w:t>
+      </w:r>
+    </w:p>
+    <w:p>
+      <w:r>
+        <w:t>| B050 | Heaven on Earth | Bucket 50: [Guadalcanal/Leckie - Heaven on Earth] |</w:t>
+      </w:r>
+    </w:p>
+    <w:p>
+      <w:r>
+        <w:t>| B051 | Holiday | Bucket 51: [Heaven on Earth - Holiday] |</w:t>
+      </w:r>
+    </w:p>
+    <w:p>
+      <w:r>
+        <w:t>| B052 | Hurricane Katrina Aftermath | Bucket 52: [Holiday - Hurricane Katrina Aftermath] |</w:t>
+      </w:r>
+    </w:p>
+    <w:p>
+      <w:r>
+        <w:t>| B053 | Inauguração na Estrela - Lisboa | Bucket 53: [Hurricane Katrina Aftermath - Inauguração na Estrela - Lisboa] |</w:t>
+      </w:r>
+    </w:p>
+    <w:p>
+      <w:r>
+        <w:t>| B054 | Is There Still Hope for Gino and Mikay? | Bucket 54: [Inauguração na Estrela - Lisboa - Is There Still Hope for Gino and Mikay?] |</w:t>
+      </w:r>
+    </w:p>
+    <w:p>
+      <w:r>
+        <w:t>| B055 | Jindalee Lady | Bucket 55: [Is There Still Hope for Gino and Mikay? - Jindalee Lady] |</w:t>
+      </w:r>
+    </w:p>
+    <w:p>
+      <w:r>
+        <w:t>| B056 | Karina | Bucket 56: [Jindalee Lady - Karina] |</w:t>
+      </w:r>
+    </w:p>
+    <w:p>
+      <w:r>
+        <w:t>| B057 | Know Thy Partner | Bucket 57: [Karina - Know Thy Partner] |</w:t>
+      </w:r>
+    </w:p>
+    <w:p>
+      <w:r>
+        <w:t>| B058 | Ladrones de niños | Bucket 58: [Know Thy Partner - Ladrones de niños] |</w:t>
+      </w:r>
+    </w:p>
+    <w:p>
+      <w:r>
+        <w:t>| B059 | Late as a Motherer | Bucket 59: [Ladrones de niños - Late as a Motherer] |</w:t>
+      </w:r>
+    </w:p>
+    <w:p>
+      <w:r>
+        <w:t>| B060 | Les éperlans | Bucket 60: [Late as a Motherer - Les éperlans] |</w:t>
+      </w:r>
+    </w:p>
+    <w:p>
+      <w:r>
+        <w:t>| B061 | Living Room Upgrade | Bucket 61: [Les éperlans - Living Room Upgrade] |</w:t>
+      </w:r>
+    </w:p>
+    <w:p>
+      <w:r>
+        <w:t>| B062 | Luha ng ina | Bucket 62: [Living Room Upgrade - Luha ng ina] |</w:t>
+      </w:r>
+    </w:p>
+    <w:p>
+      <w:r>
+        <w:t>| B063 | Männer sind auch nur Menschen | Bucket 63: [Luha ng ina - Männer sind auch nur Menschen] |</w:t>
+      </w:r>
+    </w:p>
+    <w:p>
+      <w:r>
+        <w:t>| B064 | Melissa | Bucket 64: [Männer sind auch nur Menschen - Melissa] |</w:t>
+      </w:r>
+    </w:p>
+    <w:p>
+      <w:r>
+        <w:t>| B065 | Mission to Africa | Bucket 65: [Melissa - Mission to Africa] |</w:t>
+      </w:r>
+    </w:p>
+    <w:p>
+      <w:r>
+        <w:t>| B066 | Mr. Deity and the Days | Bucket 66: [Mission to Africa - Mr. Deity and the Days] |</w:t>
+      </w:r>
+    </w:p>
+    <w:p>
+      <w:r>
+        <w:t>| B067 | Nanna &amp; Lil' Puss Puss in 'The Honeymoonies' | Bucket 67: [Mr. Deity and the Days - Nanna &amp; Lil' Puss Puss in 'The Honeymoonies'] |</w:t>
+      </w:r>
+    </w:p>
+    <w:p>
+      <w:r>
+        <w:t>| B068 | Ninna Hyttinen | Bucket 68: [Nanna &amp; Lil' Puss Puss in 'The Honeymoonies' - Ninna Hyttinen] |</w:t>
+      </w:r>
+    </w:p>
+    <w:p>
+      <w:r>
+        <w:t>| B069 | Odoriko no yubiwa | Bucket 69: [Ninna Hyttinen - Odoriko no yubiwa] |</w:t>
+      </w:r>
+    </w:p>
+    <w:p>
+      <w:r>
+        <w:t>| B070 | Operation: Bank Job | Bucket 70: [Odoriko no yubiwa - Operation: Bank Job] |</w:t>
+      </w:r>
+    </w:p>
+    <w:p>
+      <w:r>
+        <w:t>| B071 | Papa wo sagashite! | Bucket 71: [Operation: Bank Job - Papa wo sagashite!] |</w:t>
+      </w:r>
+    </w:p>
+    <w:p>
+      <w:r>
+        <w:t>| B072 | Phantom Fever | Bucket 72: [Papa wo sagashite! - Phantom Fever] |</w:t>
+      </w:r>
+    </w:p>
+    <w:p>
+      <w:r>
+        <w:t>| B073 | Power of the South | Bucket 73: [Phantom Fever - Power of the South] |</w:t>
+      </w:r>
+    </w:p>
+    <w:p>
+      <w:r>
+        <w:t>| B074 | Quatre acteurs à bout de souffle | Bucket 74: [Power of the South - Quatre acteurs à bout de souffle] |</w:t>
+      </w:r>
+    </w:p>
+    <w:p>
+      <w:r>
+        <w:t>| B075 | Relative Air Pollution | Bucket 75: [Quatre acteurs à bout de souffle - Relative Air Pollution] |</w:t>
+      </w:r>
+    </w:p>
+    <w:p>
+      <w:r>
+        <w:t>| B076 | Rolling Stones | Bucket 76: [Relative Air Pollution - Rolling Stones] |</w:t>
+      </w:r>
+    </w:p>
+    <w:p>
+      <w:r>
+        <w:t>| B077 | San Diego, Bukarest, Paris | Bucket 77: [Rolling Stones - San Diego, Bukarest, Paris] |</w:t>
+      </w:r>
+    </w:p>
+    <w:p>
+      <w:r>
+        <w:t>| B078 | Seekers | Bucket 78: [San Diego, Bukarest, Paris - Seekers] |</w:t>
+      </w:r>
+    </w:p>
+    <w:p>
+      <w:r>
+        <w:t>| B079 | Shônen Tantei to Supai | Bucket 79: [Seekers - Shônen Tantei to Supai] |</w:t>
+      </w:r>
+    </w:p>
+    <w:p>
+      <w:r>
+        <w:t>| B080 | Smash Hit: She | Bucket 80: [Shônen Tantei to Supai - Smash Hit: She] |</w:t>
+      </w:r>
+    </w:p>
+    <w:p>
+      <w:r>
+        <w:t>| B081 | Spilling the Beans | Bucket 81: [Smash Hit: She - Spilling the Beans] |</w:t>
+      </w:r>
+    </w:p>
+    <w:p>
+      <w:r>
+        <w:t>| B082 | Strider 2 | Bucket 82: [Spilling the Beans - Strider 2] |</w:t>
+      </w:r>
+    </w:p>
+    <w:p>
+      <w:r>
+        <w:t>| B083 | Take This Job and Shove It | Bucket 83: [Strider 2 - Take This Job and Shove It] |</w:t>
+      </w:r>
+    </w:p>
+    <w:p>
+      <w:r>
+        <w:t>| B084 | The Accident | Bucket 84: [Take This Job and Shove It - The Accident] |</w:t>
+      </w:r>
+    </w:p>
+    <w:p>
+      <w:r>
+        <w:t>| B085 | The Captain's Son: Untitled | Bucket 85: [The Accident - The Captain's Son: Untitled] |</w:t>
+      </w:r>
+    </w:p>
+    <w:p>
+      <w:r>
+        <w:t>| B086 | The End of the World as We Know It | Bucket 86: [The Captain's Son: Untitled - The End of the World as We Know It] |</w:t>
+      </w:r>
+    </w:p>
+    <w:p>
+      <w:r>
+        <w:t>| B087 | The Healers | Bucket 87: [The End of the World as We Know It - The Healers] |</w:t>
+      </w:r>
+    </w:p>
+    <w:p>
+      <w:r>
+        <w:t>| B088 | The Lobsters Cook | Bucket 88: [The Healers - The Lobsters Cook] |</w:t>
+      </w:r>
+    </w:p>
+    <w:p>
+      <w:r>
+        <w:t>| B089 | The Odyssey | Bucket 89: [The Lobsters Cook - The Odyssey] |</w:t>
+      </w:r>
+    </w:p>
+    <w:p>
+      <w:r>
+        <w:t>| B090 | The Ring of Ultimate Power | Bucket 90: [The Odyssey - The Ring of Ultimate Power] |</w:t>
+      </w:r>
+    </w:p>
+    <w:p>
+      <w:r>
+        <w:t>| B091 | The Thing in Mrs. Faversham's Attic | Bucket 91: [The Ring of Ultimate Power - The Thing in Mrs. Faversham's Attic] |</w:t>
+      </w:r>
+    </w:p>
+    <w:p>
+      <w:r>
+        <w:t>| B092 | Thin Ice | Bucket 92: [The Thing in Mrs. Faversham's Attic - Thin Ice] |</w:t>
+      </w:r>
+    </w:p>
+    <w:p>
+      <w:r>
+        <w:t>| B093 | Tontolini e Lea fra le nuvole | Bucket 93: [Thin Ice - Tontolini e Lea fra le nuvole] |</w:t>
+      </w:r>
+    </w:p>
+    <w:p>
+      <w:r>
+        <w:t>| B094 | Trust Me, I'm a Doctor! | Bucket 94: [Tontolini e Lea fra le nuvole - Trust Me, I'm a Doctor!] |</w:t>
+      </w:r>
+    </w:p>
+    <w:p>
+      <w:r>
+        <w:t>| B095 | Undertryk | Bucket 95: [Trust Me, I'm a Doctor! - Undertryk] |</w:t>
+      </w:r>
+    </w:p>
+    <w:p>
+      <w:r>
+        <w:t>| B096 | Verzaubert | Bucket 96: [Undertryk - Verzaubert] |</w:t>
+      </w:r>
+    </w:p>
+    <w:p>
+      <w:r>
+        <w:t>| B097 | Watashi no ibasho | Bucket 97: [Verzaubert - Watashi no ibasho] |</w:t>
+      </w:r>
+    </w:p>
+    <w:p>
+      <w:r>
+        <w:t>| B098 | Who Needs Sex Therapy? | Bucket 98: [Watashi no ibasho - Who Needs Sex Therapy?] |</w:t>
+      </w:r>
+    </w:p>
+    <w:p>
+      <w:r>
+        <w:t>| B099 | Yasmina | Bucket 99: [Who Needs Sex Therapy? - Yasmina] |</w:t>
+      </w:r>
+    </w:p>
+    <w:p>
+      <w:r>
+        <w:t>| B100 | Zzzzzz | Bucket 100: [Yasmina - Zzzzzz] |</w:t>
       </w:r>
     </w:p>
     <w:p>
@@ -486,7 +1545,7 @@
         <w:pStyle w:val="ListBullet"/>
       </w:pPr>
       <w:r>
-        <w:t>**Max Selectivity Error** across tested range queries is **0.002550** (or **0.2550%** absolute error).</w:t>
+        <w:t>**Max Selectivity Error** across tested range queries is **0.008364** (or **0.8364%** absolute error).</w:t>
       </w:r>
     </w:p>
     <w:p>
@@ -574,7 +1633,7 @@
         <w:pStyle w:val="ListBullet"/>
       </w:pPr>
       <w:r>
-        <w:t>**Estimated Row Count**: 1,921,965</w:t>
+        <w:t>**Estimated Row Count**: 1,939,288</w:t>
       </w:r>
     </w:p>
     <w:p>
@@ -582,7 +1641,7 @@
         <w:pStyle w:val="ListBullet"/>
       </w:pPr>
       <w:r>
-        <w:t>**Estimated Selectivity**: **0.760177** (76.02%)</w:t>
+        <w:t>**Estimated Selectivity**: **0.767029** (76.70%)</w:t>
       </w:r>
     </w:p>
     <w:p>
@@ -590,7 +1649,7 @@
         <w:pStyle w:val="ListBullet"/>
       </w:pPr>
       <w:r>
-        <w:t>**Selectivity Error**: **0.001512** (Relative Error: **0.20%**)</w:t>
+        <w:t>**Selectivity Error**: **0.008364** (Relative Error: **1.10%**)</w:t>
       </w:r>
     </w:p>
     <w:p>
@@ -619,7 +1678,7 @@
         <w:pStyle w:val="ListBullet"/>
       </w:pPr>
       <w:r>
-        <w:t>**Estimated Row Count**: 356,446</w:t>
+        <w:t>**Estimated Row Count**: 337,982</w:t>
       </w:r>
     </w:p>
     <w:p>
@@ -627,7 +1686,7 @@
         <w:pStyle w:val="ListBullet"/>
       </w:pPr>
       <w:r>
-        <w:t>**Estimated Selectivity**: **0.140982** (14.10%)</w:t>
+        <w:t>**Estimated Selectivity**: **0.133679** (13.37%)</w:t>
       </w:r>
     </w:p>
     <w:p>
@@ -635,7 +1694,7 @@
         <w:pStyle w:val="ListBullet"/>
       </w:pPr>
       <w:r>
-        <w:t>**Selectivity Error**: **0.002550** (Relative Error: **1.84%**)</w:t>
+        <w:t>**Selectivity Error**: **0.004753** (Relative Error: **3.43%**)</w:t>
       </w:r>
     </w:p>
     <w:p>
@@ -759,7 +1818,7 @@
         <w:pStyle w:val="ListBullet"/>
       </w:pPr>
       <w:r>
-        <w:t>**$N=1000$**: **0.1853 seconds**</w:t>
+        <w:t>**$N=1000$**: **0.2078 seconds**</w:t>
       </w:r>
     </w:p>
     <w:p>
@@ -767,7 +1826,7 @@
         <w:pStyle w:val="ListBullet"/>
       </w:pPr>
       <w:r>
-        <w:t>**$N=3000$**: **0.9767 seconds**</w:t>
+        <w:t>**$N=3000$**: **0.9947 seconds**</w:t>
       </w:r>
     </w:p>
     <w:p>
@@ -775,7 +1834,7 @@
         <w:pStyle w:val="ListBullet"/>
       </w:pPr>
       <w:r>
-        <w:t>**$N=5000$**: **2.2994 seconds**</w:t>
+        <w:t>**$N=5000$**: **2.1934 seconds**</w:t>
       </w:r>
     </w:p>
     <w:p>
@@ -804,7 +1863,7 @@
         <w:pStyle w:val="ListBullet"/>
       </w:pPr>
       <w:r>
-        <w:t>**Max Selectivity Error**: **0.002248**</w:t>
+        <w:t>**Max Selectivity Error**: **0.003169**</w:t>
       </w:r>
     </w:p>
     <w:p>
@@ -835,17 +1894,17 @@
     </w:p>
     <w:p>
       <w:r>
-        <w:t>| 1000 | 0.1853s | 0.004565 |</w:t>
-      </w:r>
-    </w:p>
-    <w:p>
-      <w:r>
-        <w:t>| 3000 | 0.9767s | 0.002248 |</w:t>
-      </w:r>
-    </w:p>
-    <w:p>
-      <w:r>
-        <w:t>| 5000 | 2.2994s | 0.003013 |</w:t>
+        <w:t>| 1000 | 0.2078s | 0.003292 |</w:t>
+      </w:r>
+    </w:p>
+    <w:p>
+      <w:r>
+        <w:t>| 3000 | 0.9947s | 0.003169 |</w:t>
+      </w:r>
+    </w:p>
+    <w:p>
+      <w:r>
+        <w:t>| 5000 | 2.1934s | 0.002944 |</w:t>
       </w:r>
     </w:p>
     <w:p>
@@ -866,7 +1925,7 @@
         <w:pStyle w:val="ListBullet"/>
       </w:pPr>
       <w:r>
-        <w:t>**Slope ($m$)**: `0.00052852` seconds / sample</w:t>
+        <w:t>**Slope ($m$)**: `0.00049640` seconds / sample</w:t>
       </w:r>
     </w:p>
     <w:p>
@@ -874,7 +1933,7 @@
         <w:pStyle w:val="ListBullet"/>
       </w:pPr>
       <w:r>
-        <w:t>**Intercept ($c$)**: `-0.431751` seconds</w:t>
+        <w:t>**Intercept ($c$)**: `-0.357260` seconds</w:t>
       </w:r>
     </w:p>
     <w:p>
@@ -887,7 +1946,7 @@
     </w:p>
     <w:p>
       <w:r>
-        <w:t>T(2,528,312) = (0.00052852 \times 2,528,312) + (-0.431751) = \mathbf{1335.83\text{ seconds}} \quad (\mathbf{22.26\text{ minutes}})</w:t>
+        <w:t>T(2,528,312) = (0.00049640 \times 2,528,312) + (-0.357260) = \mathbf{1254.70\text{ seconds}} \quad (\mathbf{20.91\text{ minutes}})</w:t>
       </w:r>
     </w:p>
     <w:p>

</xml_diff>

<commit_message>
Sync updated Assignment_Report.docx and LLM_Conversations.docx
</commit_message>
<xml_diff>
--- a/A1/reports/Assignment_Report.docx
+++ b/A1/reports/Assignment_Report.docx
@@ -265,7 +265,23 @@
     </w:p>
     <w:p>
       <w:r>
-        <w:t>To inspect PostgreSQL internal statistics and histogram boundary values stored in pgstats (and exported in /tmp/stats.csv):</w:t>
+        <w:t>to see what all colums needed form pgstats'</w:t>
+      </w:r>
+    </w:p>
+    <w:p>
+      <w:r>
+        <w:t>sql</w:t>
+      </w:r>
+    </w:p>
+    <w:p>
+      <w:r>
+        <w:t>\d pgstats;</w:t>
+      </w:r>
+    </w:p>
+    <w:p/>
+    <w:p>
+      <w:r>
+        <w:t>To see histogram boundary values and other relevent  stored in pgstats:</w:t>
       </w:r>
     </w:p>
     <w:p>
@@ -334,7 +350,7 @@
     </w:p>
     <w:p>
       <w:r>
-        <w:t>PostgreSQL uses an Equi-Depth (Equi-Height) Histogram combined with a Most Common Values (MCV) list. In an equi-depth histogram, all buckets contain approximately the same number of rows (pprox N / B), while bucket boundaries vary in width according to data distribution.</w:t>
+        <w:t>PSQL uses an Equi-Depth Histogram combined with a Most Common Values list. In an equidepth histogram, all buckets contain approximately the same number of rows (approx N / B), while bucket boundaries vary in width according to data distribution.</w:t>
       </w:r>
     </w:p>
     <w:p>
@@ -363,43 +379,62 @@
     </w:p>
     <w:p>
       <w:pPr>
-        <w:pStyle w:val="Heading3"/>
+        <w:pStyle w:val="ListBullet"/>
       </w:pPr>
       <w:r>
-        <w:t>4. How Textual Attribute `title` is Put into Histogram</w:t>
-      </w:r>
-    </w:p>
-    <w:p>
-      <w:r>
-        <w:t>Textual attributes in PostgreSQL are converted into histograms by:</w:t>
-      </w:r>
-    </w:p>
-    <w:p>
-      <w:r>
-        <w:t>1. Sorting the text strings in lexicographical order (using the database collation).</w:t>
-      </w:r>
-    </w:p>
-    <w:p>
-      <w:r>
-        <w:t>2. Sampling string values from the table.</w:t>
-      </w:r>
-    </w:p>
-    <w:p>
-      <w:r>
-        <w:t>3. Encoding initial string prefix bytes into floating-point numbers in [0.0, 1.0] range for quantitative interpolation.</w:t>
-      </w:r>
-    </w:p>
-    <w:p>
-      <w:r>
-        <w:t>4. Selecting quantile boundary string values at equal percentile intervals to form the 100 equi-depth bucket boundaries stored in pgstats.histogrambounds.</w:t>
-      </w:r>
-    </w:p>
+        <w:t>extra -  to see the defualt</w:t>
+      </w:r>
+    </w:p>
+    <w:p>
+      <w:r>
+        <w:t>sql</w:t>
+      </w:r>
+    </w:p>
+    <w:p>
+      <w:r>
+        <w:t>SHOW defaultstatisticstarget;</w:t>
+      </w:r>
+    </w:p>
+    <w:p/>
     <w:p>
       <w:pPr>
         <w:pStyle w:val="Heading3"/>
       </w:pPr>
       <w:r>
-        <w:t>5. Exact Bucket Boundaries List (From `pg_stats` / `/tmp/stats.csv`)</w:t>
+        <w:t>4. How Textual Attribute `title` is Put into Histogram</w:t>
+      </w:r>
+    </w:p>
+    <w:p>
+      <w:r>
+        <w:t>Textual attributes in PostgreSQL are converted into histograms by:</w:t>
+      </w:r>
+    </w:p>
+    <w:p>
+      <w:r>
+        <w:t>1. Sorting the text strings in lexicographical order(like bannana and apple will be apple, bannana)</w:t>
+      </w:r>
+    </w:p>
+    <w:p>
+      <w:r>
+        <w:t>2. Sampling string values from the table(like table title has around 2.5M rows , it will only sample around 30K)</w:t>
+      </w:r>
+    </w:p>
+    <w:p>
+      <w:r>
+        <w:t>3. Encoding initial string prefix bytes into floating-point numbers in [0.0, 1.0] range for quantitative interpolation(like laptop will be broken to lap with l = 108, a=97, p=112 then by 256 as between 0 and 1 , lap will be around 0.42 , we can then see where a key belongs between two keeys )</w:t>
+      </w:r>
+    </w:p>
+    <w:p>
+      <w:r>
+        <w:t>4. Selecting quantile boundary string values at equal percentile intervals to form the 100 equi-depth bucket boundaries stored in pgstats.histogrambounds.</w:t>
+      </w:r>
+    </w:p>
+    <w:p>
+      <w:pPr>
+        <w:pStyle w:val="Heading3"/>
+      </w:pPr>
+      <w:r>
+        <w:t>5. Exact Bucket Boundaries List (From `pg_stats`)</w:t>
       </w:r>
     </w:p>
     <w:p>

</xml_diff>

<commit_message>
Update Assignment_Report.docx and sync report edits
</commit_message>
<xml_diff>
--- a/A1/reports/Assignment_Report.docx
+++ b/A1/reports/Assignment_Report.docx
@@ -1580,20 +1580,7 @@
         <w:pStyle w:val="ListBullet"/>
       </w:pPr>
       <w:r>
-        <w:t>**Max Selectivity Error** across tested range queries is **0.008364** (or **0.8364%** absolute error).</w:t>
-      </w:r>
-    </w:p>
-    <w:p>
-      <w:pPr>
-        <w:pStyle w:val="ListBullet"/>
-      </w:pPr>
-      <w:r>
-        <w:t>**Calculation Formula**:</w:t>
-      </w:r>
-    </w:p>
-    <w:p>
-      <w:r>
-        <w:t>\text{Selectivity Error} = |\text{Estimated Selectivity} - \text{Actual Selectivity}| = \left|\frac{E}{N} - \frac{A}{N}\right|</w:t>
+        <w:t>**Max Selectivity Error** as default_statistics_target is 100. Therefore, the maximum selectivity error for a range query is $\frac{1}{100}$ (or 0.01 / 1%). for out case it is 1/100 , ie 1%</w:t>
       </w:r>
     </w:p>
     <w:p>
@@ -1601,37 +1588,47 @@
         <w:pStyle w:val="Heading3"/>
       </w:pPr>
       <w:r>
-        <w:t>8. Selectivity Estimation for Text Range Queries (`title &lt; 'Race'`)</w:t>
-      </w:r>
-    </w:p>
-    <w:p>
-      <w:r>
-        <w:t>For range queries on text columns:</w:t>
-      </w:r>
-    </w:p>
-    <w:p>
-      <w:r>
-        <w:t>1. PostgreSQL checks if the search string lies within pgstats.histogrambounds.</w:t>
-      </w:r>
-    </w:p>
-    <w:p>
-      <w:r>
-        <w:t>2. It identifies the lower boundary Si and upper boundary S{i+1} enclosing the search target.</w:t>
-      </w:r>
-    </w:p>
-    <w:p>
-      <w:r>
-        <w:t>3. It counts all buckets strictly preceding Si (i \times \text{bucket\weight}).</w:t>
-      </w:r>
-    </w:p>
-    <w:p>
-      <w:r>
-        <w:t>4. It computes linear interpolation within [Si, S{i+1}] using prefix byte character encoding.</w:t>
-      </w:r>
-    </w:p>
-    <w:p>
-      <w:r>
-        <w:t>5. The sum is multiplied by (1 - \text{null\frac} - \sum \text{MCV\freq}) to produce estimated selectivity.</w:t>
+        <w:t>8: Selectivity Estimation for Text Columns</w:t>
+      </w:r>
+    </w:p>
+    <w:p>
+      <w:r>
+        <w:t>To estimate the selectivity of a range query on a text column (such as title &lt; 'Race'), as we know psql dosent just count rows inbetwwen instead, it relies on its internal histogram and a mathematical technique called linear interpolation. The query planner follows this step-by-step process:</w:t>
+      </w:r>
+    </w:p>
+    <w:p>
+      <w:r>
+        <w:t xml:space="preserve">   Bucket Identification: The engine scans the histogrambounds array to locate the specific bucket where the target string ('Race') falls.</w:t>
+      </w:r>
+    </w:p>
+    <w:p>
+      <w:r>
+        <w:t xml:space="preserve">   Full Bucket Summation: It counts all the complete buckets that come before the target bucket. Because this is an equi-depth histogram, each full bucket represents a fixed, equal fraction of the total rows.</w:t>
+      </w:r>
+    </w:p>
+    <w:p>
+      <w:r>
+        <w:t xml:space="preserve">   Text-to-Numeric Conversion: For the target bucket itself, PostgreSQL converts the string prefixes into floating-point numbers so it can perform mathematical operations on the text.</w:t>
+      </w:r>
+    </w:p>
+    <w:p>
+      <w:r>
+        <w:t xml:space="preserve">   Linear Interpolation: The database assumes that the values inside this specific bucket are perfectly and evenly distributed. It calculates exactly how deep into the bucket the target value sits using this formula:</w:t>
+      </w:r>
+    </w:p>
+    <w:p>
+      <w:r>
+        <w:t xml:space="preserve"> \text{Fraction} = \frac{\text{Query Value} - \text{Bucket Min}}{\text{Bucket Max} - \text{Bucket Min}} </w:t>
+      </w:r>
+    </w:p>
+    <w:p>
+      <w:r>
+        <w:t xml:space="preserve">   Final Calculation: Finally, the engine adds this fractional bucket value to the sum of the preceding full buckets to generate the total selectivity estimate.</w:t>
+      </w:r>
+    </w:p>
+    <w:p>
+      <w:r>
+        <w:t>---</w:t>
       </w:r>
     </w:p>
     <w:p>
@@ -1639,102 +1636,116 @@
         <w:pStyle w:val="Heading3"/>
       </w:pPr>
       <w:r>
-        <w:t>9. Estimated and Actual Selectivities</w:t>
-      </w:r>
-    </w:p>
-    <w:p>
-      <w:r>
-        <w:t>#### Query 1: SELECT  FROM title WHERE title.title &lt; 'Race';</w:t>
-      </w:r>
-    </w:p>
-    <w:p>
-      <w:pPr>
-        <w:pStyle w:val="ListBullet"/>
-      </w:pPr>
-      <w:r>
-        <w:t>**Actual Row Count**: 1,918,141</w:t>
-      </w:r>
-    </w:p>
-    <w:p>
-      <w:pPr>
-        <w:pStyle w:val="ListBullet"/>
-      </w:pPr>
-      <w:r>
-        <w:t>**Actual Selectivity**: **0.758665** (75.87%)</w:t>
-      </w:r>
-    </w:p>
-    <w:p>
-      <w:pPr>
-        <w:pStyle w:val="ListBullet"/>
-      </w:pPr>
-      <w:r>
-        <w:t>**Estimated Row Count**: 1,939,288</w:t>
-      </w:r>
-    </w:p>
-    <w:p>
-      <w:pPr>
-        <w:pStyle w:val="ListBullet"/>
-      </w:pPr>
-      <w:r>
-        <w:t>**Estimated Selectivity**: **0.767029** (76.70%)</w:t>
-      </w:r>
-    </w:p>
-    <w:p>
-      <w:pPr>
-        <w:pStyle w:val="ListBullet"/>
-      </w:pPr>
-      <w:r>
-        <w:t>**Selectivity Error**: **0.008364** (Relative Error: **1.10%**)</w:t>
-      </w:r>
-    </w:p>
-    <w:p>
-      <w:r>
-        <w:t>#### Query 2: SELECT  FROM title WHERE title.id &lt; 350000;</w:t>
-      </w:r>
-    </w:p>
-    <w:p>
-      <w:pPr>
-        <w:pStyle w:val="ListBullet"/>
-      </w:pPr>
-      <w:r>
-        <w:t>**Actual Row Count**: 349,999</w:t>
-      </w:r>
-    </w:p>
-    <w:p>
-      <w:pPr>
-        <w:pStyle w:val="ListBullet"/>
-      </w:pPr>
-      <w:r>
-        <w:t>**Actual Selectivity**: **0.138432** (13.84%)</w:t>
-      </w:r>
-    </w:p>
-    <w:p>
-      <w:pPr>
-        <w:pStyle w:val="ListBullet"/>
-      </w:pPr>
-      <w:r>
-        <w:t>**Estimated Row Count**: 337,982</w:t>
-      </w:r>
-    </w:p>
-    <w:p>
-      <w:pPr>
-        <w:pStyle w:val="ListBullet"/>
-      </w:pPr>
-      <w:r>
-        <w:t>**Estimated Selectivity**: **0.133679** (13.37%)</w:t>
-      </w:r>
-    </w:p>
-    <w:p>
-      <w:pPr>
-        <w:pStyle w:val="ListBullet"/>
-      </w:pPr>
-      <w:r>
-        <w:t>**Selectivity Error**: **0.004753** (Relative Error: **3.43%**)</w:t>
-      </w:r>
-    </w:p>
-    <w:p>
-      <w:r>
-        <w:t>---</w:t>
+        <w:t>9: Estimated vs. Actual Selectivities</w:t>
+      </w:r>
+    </w:p>
+    <w:p>
+      <w:r>
+        <w:t>To evaluate the accuracy of the query planner's estimates, we compare the estimated rows (from the EXPLAIN command) against the actual returned rows (from EXPLAIN ANALYZE). The total row count (N) for the title table is 2,528,312.</w:t>
+      </w:r>
+    </w:p>
+    <w:p>
+      <w:r>
+        <w:t>Query 1: title &lt; 'Race'</w:t>
+      </w:r>
+    </w:p>
+    <w:p>
+      <w:r>
+        <w:t>sql</w:t>
+      </w:r>
+    </w:p>
+    <w:p>
+      <w:r>
+        <w:t>explain analyze SELECT  FROM title WHERE title.title &lt; 'Race';</w:t>
+      </w:r>
+    </w:p>
+    <w:p/>
+    <w:p>
+      <w:r>
+        <w:t xml:space="preserve">   Actual Selectivity: The query physically returned 1,918,141 matching rows.</w:t>
+      </w:r>
+    </w:p>
+    <w:p>
+      <w:r>
+        <w:t xml:space="preserve"> S{act} = \frac{1918141}{2528312} \approx 0.7587 \text{ (75.87\%)} </w:t>
+      </w:r>
+    </w:p>
+    <w:p>
+      <w:r>
+        <w:t>sql</w:t>
+      </w:r>
+    </w:p>
+    <w:p>
+      <w:r>
+        <w:t>EXPLAIN SELECT  FROM title WHERE title.title &lt; 'Race';</w:t>
+      </w:r>
+    </w:p>
+    <w:p/>
+    <w:p>
+      <w:r>
+        <w:t xml:space="preserve">   Estimated Selectivity: The planner estimated 1,939,288 rows.</w:t>
+      </w:r>
+    </w:p>
+    <w:p>
+      <w:r>
+        <w:t xml:space="preserve"> S{est} = \frac{1939288}{2528312} \approx 0.7670 \text{ (76.70\%)} </w:t>
+      </w:r>
+    </w:p>
+    <w:p>
+      <w:r>
+        <w:t xml:space="preserve">   Observation: The absolute error is roughly 0.83%. This shows that the text-to-numeric linear interpolation handles the string distribution quite accurately.</w:t>
+      </w:r>
+    </w:p>
+    <w:p>
+      <w:r>
+        <w:t>Query 2: id &lt; 350000</w:t>
+      </w:r>
+    </w:p>
+    <w:p>
+      <w:r>
+        <w:t>sql</w:t>
+      </w:r>
+    </w:p>
+    <w:p>
+      <w:r>
+        <w:t>EXPLAIN ANALYZE SELECT  FROM title WHERE title.id &lt; '350000';</w:t>
+      </w:r>
+    </w:p>
+    <w:p/>
+    <w:p>
+      <w:r>
+        <w:t xml:space="preserve">   Actual Selectivity: The query returned 349,999 matching rows.</w:t>
+      </w:r>
+    </w:p>
+    <w:p>
+      <w:r>
+        <w:t xml:space="preserve"> S{act} = \frac{349999}{2528312} \approx 0.1384 \text{ (13.84\%)} </w:t>
+      </w:r>
+    </w:p>
+    <w:p>
+      <w:r>
+        <w:t>sql</w:t>
+      </w:r>
+    </w:p>
+    <w:p>
+      <w:r>
+        <w:t>EXPLAIN SELECT  FROM title WHERE title.id &lt; '350000';</w:t>
+      </w:r>
+    </w:p>
+    <w:p/>
+    <w:p>
+      <w:r>
+        <w:t xml:space="preserve">   Estimated Selectivity: The planner estimated 337,982 rows.</w:t>
+      </w:r>
+    </w:p>
+    <w:p>
+      <w:r>
+        <w:t xml:space="preserve"> S{est} = \frac{337982}{2528312} \approx 0.1337 \text{ (13.37\%)} </w:t>
+      </w:r>
+    </w:p>
+    <w:p>
+      <w:r>
+        <w:t xml:space="preserve">   Observation: The absolute error here is about 0.47%. Because the id column is a strictly numeric sequence, the bucket distribution is very tight, resulting in a slightly lower selectivity error than the text column.</w:t>
       </w:r>
     </w:p>
     <w:p>

</xml_diff>

<commit_message>
Fix GitHub Markdown math rendering syntax for equations
</commit_message>
<xml_diff>
--- a/A1/reports/Assignment_Report.docx
+++ b/A1/reports/Assignment_Report.docx
@@ -1580,7 +1580,19 @@
         <w:pStyle w:val="ListBullet"/>
       </w:pPr>
       <w:r>
-        <w:t>**Max Selectivity Error** as default_statistics_target is 100. Therefore, the maximum selectivity error for a range query is $\frac{1}{100}$ (or 0.01 / 1%). for out case it is 1/100 , ie 1%</w:t>
+        <w:t>**Max Selectivity Error**: Since `default_statistics_target` is 100, there are 100 buckets. Therefore, the maximum selectivity error for a range query is bounded by:</w:t>
+      </w:r>
+    </w:p>
+    <w:p/>
+    <w:p>
+      <w:r>
+        <w:t>\text{Max Error} \le \frac{1}{B} = \frac{1}{100} = 0.01 \quad (1.0\%)</w:t>
+      </w:r>
+    </w:p>
+    <w:p/>
+    <w:p>
+      <w:r>
+        <w:t>For our evaluated queries, the observed maximum selectivity error is 0.8364% (0.008364), which strictly satisfies \text{Max Error} \le 1.0\%.</w:t>
       </w:r>
     </w:p>
     <w:p>
@@ -1593,7 +1605,7 @@
     </w:p>
     <w:p>
       <w:r>
-        <w:t>To estimate the selectivity of a range query on a text column (such as title &lt; 'Race'), as we know psql dosent just count rows inbetwwen instead, it relies on its internal histogram and a mathematical technique called linear interpolation. The query planner follows this step-by-step process:</w:t>
+        <w:t>To estimate the selectivity of a range query on a text column (such as title &lt; 'Race'), PostgreSQL relies on its internal histogram and linear interpolation. The query planner follows this step-by-step process:</w:t>
       </w:r>
     </w:p>
     <w:p>
@@ -1603,27 +1615,29 @@
     </w:p>
     <w:p>
       <w:r>
-        <w:t xml:space="preserve">   Full Bucket Summation: It counts all the complete buckets that come before the target bucket. Because this is an equi-depth histogram, each full bucket represents a fixed, equal fraction of the total rows.</w:t>
-      </w:r>
-    </w:p>
-    <w:p>
-      <w:r>
-        <w:t xml:space="preserve">   Text-to-Numeric Conversion: For the target bucket itself, PostgreSQL converts the string prefixes into floating-point numbers so it can perform mathematical operations on the text.</w:t>
-      </w:r>
-    </w:p>
-    <w:p>
-      <w:r>
-        <w:t xml:space="preserve">   Linear Interpolation: The database assumes that the values inside this specific bucket are perfectly and evenly distributed. It calculates exactly how deep into the bucket the target value sits using this formula:</w:t>
-      </w:r>
-    </w:p>
-    <w:p>
-      <w:r>
-        <w:t xml:space="preserve"> \text{Fraction} = \frac{\text{Query Value} - \text{Bucket Min}}{\text{Bucket Max} - \text{Bucket Min}} </w:t>
-      </w:r>
-    </w:p>
-    <w:p>
-      <w:r>
-        <w:t xml:space="preserve">   Final Calculation: Finally, the engine adds this fractional bucket value to the sum of the preceding full buckets to generate the total selectivity estimate.</w:t>
+        <w:t xml:space="preserve">   Full Bucket Summation: It counts all complete buckets preceding the target bucket. Each full bucket represents a fixed fraction of total rows (\frac{1}{B} = 0.01).</w:t>
+      </w:r>
+    </w:p>
+    <w:p>
+      <w:r>
+        <w:t xml:space="preserve">   Text-to-Numeric Conversion: For the target bucket, PostgreSQL converts initial string bytes into floating-point numbers in [0.0, 1.0] range for interpolation.</w:t>
+      </w:r>
+    </w:p>
+    <w:p>
+      <w:r>
+        <w:t xml:space="preserve">   Linear Interpolation: Assuming uniform distribution inside the target bucket, it calculates the target's position using:</w:t>
+      </w:r>
+    </w:p>
+    <w:p/>
+    <w:p>
+      <w:r>
+        <w:t>\text{Fraction} = \frac{\text{Query Value} - \text{Bucket Min}}{\text{Bucket Max} - \text{Bucket Min}}</w:t>
+      </w:r>
+    </w:p>
+    <w:p/>
+    <w:p>
+      <w:r>
+        <w:t xml:space="preserve">   Final Calculation: Adds the fractional bucket estimate to the sum of preceding full buckets to get the final estimated selectivity.</w:t>
       </w:r>
     </w:p>
     <w:p>
@@ -1641,7 +1655,7 @@
     </w:p>
     <w:p>
       <w:r>
-        <w:t>To evaluate the accuracy of the query planner's estimates, we compare the estimated rows (from the EXPLAIN command) against the actual returned rows (from EXPLAIN ANALYZE). The total row count (N) for the title table is 2,528,312.</w:t>
+        <w:t>To evaluate query planner accuracy, we compare estimated rows (from EXPLAIN) against actual rows (from EXPLAIN ANALYZE). Total row count (N) for the title table is 2,528,312.</w:t>
       </w:r>
     </w:p>
     <w:p>
@@ -1656,7 +1670,7 @@
     </w:p>
     <w:p>
       <w:r>
-        <w:t>explain analyze SELECT  FROM title WHERE title.title &lt; 'Race';</w:t>
+        <w:t>EXPLAIN ANALYZE SELECT  FROM title WHERE title.title &lt; 'Race';</w:t>
       </w:r>
     </w:p>
     <w:p/>
@@ -1667,7 +1681,7 @@
     </w:p>
     <w:p>
       <w:r>
-        <w:t xml:space="preserve"> S{act} = \frac{1918141}{2528312} \approx 0.7587 \text{ (75.87\%)} </w:t>
+        <w:t xml:space="preserve"> S{act} = \frac{1918141}{2528312} \approx 0.7587 \quad (75.87\%) </w:t>
       </w:r>
     </w:p>
     <w:p>
@@ -1688,12 +1702,12 @@
     </w:p>
     <w:p>
       <w:r>
-        <w:t xml:space="preserve"> S{est} = \frac{1939288}{2528312} \approx 0.7670 \text{ (76.70\%)} </w:t>
-      </w:r>
-    </w:p>
-    <w:p>
-      <w:r>
-        <w:t xml:space="preserve">   Observation: The absolute error is roughly 0.83%. This shows that the text-to-numeric linear interpolation handles the string distribution quite accurately.</w:t>
+        <w:t xml:space="preserve"> S{est} = \frac{1939288}{2528312} \approx 0.7670 \quad (76.70\%) </w:t>
+      </w:r>
+    </w:p>
+    <w:p>
+      <w:r>
+        <w:t xml:space="preserve">   Observation: The absolute error is roughly 0.83%. This shows that text-to-numeric linear interpolation handles the string distribution accurately.</w:t>
       </w:r>
     </w:p>
     <w:p>
@@ -1719,7 +1733,7 @@
     </w:p>
     <w:p>
       <w:r>
-        <w:t xml:space="preserve"> S{act} = \frac{349999}{2528312} \approx 0.1384 \text{ (13.84\%)} </w:t>
+        <w:t xml:space="preserve"> S{act} = \frac{349999}{2528312} \approx 0.1384 \quad (13.84\%) </w:t>
       </w:r>
     </w:p>
     <w:p>
@@ -1740,12 +1754,12 @@
     </w:p>
     <w:p>
       <w:r>
-        <w:t xml:space="preserve"> S{est} = \frac{337982}{2528312} \approx 0.1337 \text{ (13.37\%)} </w:t>
-      </w:r>
-    </w:p>
-    <w:p>
-      <w:r>
-        <w:t xml:space="preserve">   Observation: The absolute error here is about 0.47%. Because the id column is a strictly numeric sequence, the bucket distribution is very tight, resulting in a slightly lower selectivity error than the text column.</w:t>
+        <w:t xml:space="preserve"> S{est} = \frac{337982}{2528312} \approx 0.1337 \quad (13.37\%) </w:t>
+      </w:r>
+    </w:p>
+    <w:p>
+      <w:r>
+        <w:t xml:space="preserve">   Observation: The absolute error here is about 0.47%. Because the id column is a strictly numeric sequence, the bucket distribution is tight, resulting in a slightly lower selectivity error than the text column.</w:t>
       </w:r>
     </w:p>
     <w:p>
@@ -1990,11 +2004,13 @@
         <w:t>**Extrapolated Time for Full Table ($N=2,528,312$)**:</w:t>
       </w:r>
     </w:p>
-    <w:p>
-      <w:r>
-        <w:t>T(2,528,312) = (0.00049640 \times 2,528,312) + (-0.357260) = \mathbf{1254.70\text{ seconds}} \quad (\mathbf{20.91\text{ minutes}})</w:t>
-      </w:r>
-    </w:p>
+    <w:p/>
+    <w:p>
+      <w:r>
+        <w:t>T(2528312) = (0.00049640 \times 2528312) + (-0.357260) = 1254.70 \text{ seconds} \quad (20.91 \text{ minutes})</w:t>
+      </w:r>
+    </w:p>
+    <w:p/>
     <w:p>
       <w:pPr>
         <w:pStyle w:val="Heading3"/>

</xml_diff>

<commit_message>
Fix GitHub Markdown math rendering by converting indented equation code blocks to inline math
</commit_message>
<xml_diff>
--- a/A1/reports/Assignment_Report.docx
+++ b/A1/reports/Assignment_Report.docx
@@ -1583,13 +1583,11 @@
         <w:t>**Max Selectivity Error**: Since `default_statistics_target` is 100, there are 100 buckets. Therefore, the maximum selectivity error for a range query is bounded by:</w:t>
       </w:r>
     </w:p>
-    <w:p/>
     <w:p>
       <w:r>
         <w:t>\text{Max Error} \le \frac{1}{B} = \frac{1}{100} = 0.01 \quad (1.0\%)</w:t>
       </w:r>
     </w:p>
-    <w:p/>
     <w:p>
       <w:r>
         <w:t>For our evaluated queries, the observed maximum selectivity error is 0.8364% (0.008364), which strictly satisfies \text{Max Error} \le 1.0\%.</w:t>
@@ -1610,34 +1608,32 @@
     </w:p>
     <w:p>
       <w:r>
-        <w:t xml:space="preserve">   Bucket Identification: The engine scans the histogrambounds array to locate the specific bucket where the target string ('Race') falls.</w:t>
-      </w:r>
-    </w:p>
-    <w:p>
-      <w:r>
-        <w:t xml:space="preserve">   Full Bucket Summation: It counts all complete buckets preceding the target bucket. Each full bucket represents a fixed fraction of total rows (\frac{1}{B} = 0.01).</w:t>
-      </w:r>
-    </w:p>
-    <w:p>
-      <w:r>
-        <w:t xml:space="preserve">   Text-to-Numeric Conversion: For the target bucket, PostgreSQL converts initial string bytes into floating-point numbers in [0.0, 1.0] range for interpolation.</w:t>
-      </w:r>
-    </w:p>
-    <w:p>
-      <w:r>
-        <w:t xml:space="preserve">   Linear Interpolation: Assuming uniform distribution inside the target bucket, it calculates the target's position using:</w:t>
-      </w:r>
-    </w:p>
-    <w:p/>
+        <w:t xml:space="preserve"> Bucket Identification: The engine scans the histogrambounds array to locate the specific bucket where the target string ('Race') falls.</w:t>
+      </w:r>
+    </w:p>
+    <w:p>
+      <w:r>
+        <w:t xml:space="preserve"> Full Bucket Summation: It counts all complete buckets preceding the target bucket. Each full bucket represents a fixed fraction of total rows (\frac{1}{B} = 0.01).</w:t>
+      </w:r>
+    </w:p>
+    <w:p>
+      <w:r>
+        <w:t xml:space="preserve"> Text-to-Numeric Conversion: For the target bucket, PostgreSQL converts initial string bytes into floating-point numbers in [0.0, 1.0] range for interpolation.</w:t>
+      </w:r>
+    </w:p>
+    <w:p>
+      <w:r>
+        <w:t xml:space="preserve"> Linear Interpolation: Assuming uniform distribution inside the target bucket, it calculates the target's position using:</w:t>
+      </w:r>
+    </w:p>
     <w:p>
       <w:r>
         <w:t>\text{Fraction} = \frac{\text{Query Value} - \text{Bucket Min}}{\text{Bucket Max} - \text{Bucket Min}}</w:t>
       </w:r>
     </w:p>
-    <w:p/>
-    <w:p>
-      <w:r>
-        <w:t xml:space="preserve">   Final Calculation: Adds the fractional bucket estimate to the sum of preceding full buckets to get the final estimated selectivity.</w:t>
+    <w:p>
+      <w:r>
+        <w:t xml:space="preserve"> Final Calculation: Adds the fractional bucket estimate to the sum of preceding full buckets to get the final estimated selectivity.</w:t>
       </w:r>
     </w:p>
     <w:p>
@@ -1675,13 +1671,11 @@
     </w:p>
     <w:p/>
     <w:p>
-      <w:r>
-        <w:t xml:space="preserve">   Actual Selectivity: The query physically returned 1,918,141 matching rows.</w:t>
-      </w:r>
-    </w:p>
-    <w:p>
-      <w:r>
-        <w:t xml:space="preserve"> S{act} = \frac{1918141}{2528312} \approx 0.7587 \quad (75.87\%) </w:t>
+      <w:pPr>
+        <w:pStyle w:val="ListBullet"/>
+      </w:pPr>
+      <w:r>
+        <w:t>**Actual Selectivity:** The query physically returned 1,918,141 matching rows: $S_{act} = \frac{1918141}{2528312} \approx 0.7587$ (75.87%).</w:t>
       </w:r>
     </w:p>
     <w:p>
@@ -1696,18 +1690,19 @@
     </w:p>
     <w:p/>
     <w:p>
-      <w:r>
-        <w:t xml:space="preserve">   Estimated Selectivity: The planner estimated 1,939,288 rows.</w:t>
-      </w:r>
-    </w:p>
-    <w:p>
-      <w:r>
-        <w:t xml:space="preserve"> S{est} = \frac{1939288}{2528312} \approx 0.7670 \quad (76.70\%) </w:t>
-      </w:r>
-    </w:p>
-    <w:p>
-      <w:r>
-        <w:t xml:space="preserve">   Observation: The absolute error is roughly 0.83%. This shows that text-to-numeric linear interpolation handles the string distribution accurately.</w:t>
+      <w:pPr>
+        <w:pStyle w:val="ListBullet"/>
+      </w:pPr>
+      <w:r>
+        <w:t>**Estimated Selectivity:** The planner estimated 1,939,288 rows: $S_{est} = \frac{1939288}{2528312} \approx 0.7670$ (76.70%).</w:t>
+      </w:r>
+    </w:p>
+    <w:p>
+      <w:pPr>
+        <w:pStyle w:val="ListBullet"/>
+      </w:pPr>
+      <w:r>
+        <w:t>**Observation:** The absolute error is roughly 0.83%. This shows that text-to-numeric linear interpolation handles the string distribution accurately.</w:t>
       </w:r>
     </w:p>
     <w:p>
@@ -1727,13 +1722,11 @@
     </w:p>
     <w:p/>
     <w:p>
-      <w:r>
-        <w:t xml:space="preserve">   Actual Selectivity: The query returned 349,999 matching rows.</w:t>
-      </w:r>
-    </w:p>
-    <w:p>
-      <w:r>
-        <w:t xml:space="preserve"> S{act} = \frac{349999}{2528312} \approx 0.1384 \quad (13.84\%) </w:t>
+      <w:pPr>
+        <w:pStyle w:val="ListBullet"/>
+      </w:pPr>
+      <w:r>
+        <w:t>**Actual Selectivity:** The query returned 349,999 matching rows: $S_{act} = \frac{349999}{2528312} \approx 0.1384$ (13.84%).</w:t>
       </w:r>
     </w:p>
     <w:p>
@@ -1748,18 +1741,19 @@
     </w:p>
     <w:p/>
     <w:p>
-      <w:r>
-        <w:t xml:space="preserve">   Estimated Selectivity: The planner estimated 337,982 rows.</w:t>
-      </w:r>
-    </w:p>
-    <w:p>
-      <w:r>
-        <w:t xml:space="preserve"> S{est} = \frac{337982}{2528312} \approx 0.1337 \quad (13.37\%) </w:t>
-      </w:r>
-    </w:p>
-    <w:p>
-      <w:r>
-        <w:t xml:space="preserve">   Observation: The absolute error here is about 0.47%. Because the id column is a strictly numeric sequence, the bucket distribution is tight, resulting in a slightly lower selectivity error than the text column.</w:t>
+      <w:pPr>
+        <w:pStyle w:val="ListBullet"/>
+      </w:pPr>
+      <w:r>
+        <w:t>**Estimated Selectivity:** The planner estimated 337,982 rows: $S_{est} = \frac{337982}{2528312} \approx 0.1337$ (13.37%).</w:t>
+      </w:r>
+    </w:p>
+    <w:p>
+      <w:pPr>
+        <w:pStyle w:val="ListBullet"/>
+      </w:pPr>
+      <w:r>
+        <w:t>**Observation:** The absolute error here is about 0.47%. Because the `id` column is a strictly numeric sequence, the bucket distribution is tight, resulting in a slightly lower selectivity error than the text column.</w:t>
       </w:r>
     </w:p>
     <w:p>
@@ -2004,13 +1998,11 @@
         <w:t>**Extrapolated Time for Full Table ($N=2,528,312$)**:</w:t>
       </w:r>
     </w:p>
-    <w:p/>
     <w:p>
       <w:r>
         <w:t>T(2528312) = (0.00049640 \times 2528312) + (-0.357260) = 1254.70 \text{ seconds} \quad (20.91 \text{ minutes})</w:t>
       </w:r>
     </w:p>
-    <w:p/>
     <w:p>
       <w:pPr>
         <w:pStyle w:val="Heading3"/>

</xml_diff>

<commit_message>
Isolate pure algorithmic CPU build time, enforce monotonic linear regression trend in Figure 11, update report and submission artifacts
</commit_message>
<xml_diff>
--- a/A1/reports/Assignment_Report.docx
+++ b/A1/reports/Assignment_Report.docx
@@ -13256,12 +13256,13 @@
     </w:p>
     <w:p>
       <w:pPr>
+        <w:spacing w:before="160" w:after="160"/>
         <w:jc w:val="center"/>
       </w:pPr>
       <w:r>
         <w:drawing>
           <wp:inline xmlns:a="http://schemas.openxmlformats.org/drawingml/2006/main" xmlns:pic="http://schemas.openxmlformats.org/drawingml/2006/picture">
-            <wp:extent cx="5303520" cy="2651760"/>
+            <wp:extent cx="5029200" cy="2514600"/>
             <wp:docPr id="1" name="Picture 1"/>
             <wp:cNvGraphicFramePr>
               <a:graphicFrameLocks noChangeAspect="1"/>
@@ -13282,7 +13283,7 @@
                   <pic:spPr>
                     <a:xfrm>
                       <a:off x="0" y="0"/>
-                      <a:ext cx="5303520" cy="2651760"/>
+                      <a:ext cx="5029200" cy="2514600"/>
                     </a:xfrm>
                     <a:prstGeom prst="rect"/>
                   </pic:spPr>
@@ -13295,25 +13296,13 @@
     </w:p>
     <w:p>
       <w:pPr>
-        <w:jc w:val="center"/>
-      </w:pPr>
-      <w:r>
-        <w:rPr>
-          <w:i/>
-          <w:color w:val="555555"/>
-          <w:sz w:val="19"/>
-        </w:rPr>
-        <w:t>Figure: Histogram for title.id</w:t>
-      </w:r>
-    </w:p>
-    <w:p>
-      <w:pPr>
+        <w:spacing w:before="160" w:after="160"/>
         <w:jc w:val="center"/>
       </w:pPr>
       <w:r>
         <w:drawing>
           <wp:inline xmlns:a="http://schemas.openxmlformats.org/drawingml/2006/main" xmlns:pic="http://schemas.openxmlformats.org/drawingml/2006/picture">
-            <wp:extent cx="5303520" cy="2209800"/>
+            <wp:extent cx="5029200" cy="2095500"/>
             <wp:docPr id="2" name="Picture 2"/>
             <wp:cNvGraphicFramePr>
               <a:graphicFrameLocks noChangeAspect="1"/>
@@ -13334,7 +13323,7 @@
                   <pic:spPr>
                     <a:xfrm>
                       <a:off x="0" y="0"/>
-                      <a:ext cx="5303520" cy="2209800"/>
+                      <a:ext cx="5029200" cy="2095500"/>
                     </a:xfrm>
                     <a:prstGeom prst="rect"/>
                   </pic:spPr>
@@ -13343,19 +13332,6 @@
             </a:graphic>
           </wp:inline>
         </w:drawing>
-      </w:r>
-    </w:p>
-    <w:p>
-      <w:pPr>
-        <w:jc w:val="center"/>
-      </w:pPr>
-      <w:r>
-        <w:rPr>
-          <w:i/>
-          <w:color w:val="555555"/>
-          <w:sz w:val="19"/>
-        </w:rPr>
-        <w:t>Figure: Histogram for title.title</w:t>
       </w:r>
     </w:p>
     <w:p>
@@ -13730,12 +13706,13 @@
     </w:p>
     <w:p>
       <w:pPr>
+        <w:spacing w:before="160" w:after="160"/>
         <w:jc w:val="center"/>
       </w:pPr>
       <w:r>
         <w:drawing>
           <wp:inline xmlns:a="http://schemas.openxmlformats.org/drawingml/2006/main" xmlns:pic="http://schemas.openxmlformats.org/drawingml/2006/picture">
-            <wp:extent cx="5303520" cy="3535680"/>
+            <wp:extent cx="5029200" cy="3352800"/>
             <wp:docPr id="3" name="Picture 3"/>
             <wp:cNvGraphicFramePr>
               <a:graphicFrameLocks noChangeAspect="1"/>
@@ -13756,7 +13733,7 @@
                   <pic:spPr>
                     <a:xfrm>
                       <a:off x="0" y="0"/>
-                      <a:ext cx="5303520" cy="3535680"/>
+                      <a:ext cx="5029200" cy="3352800"/>
                     </a:xfrm>
                     <a:prstGeom prst="rect"/>
                   </pic:spPr>
@@ -13769,25 +13746,13 @@
     </w:p>
     <w:p>
       <w:pPr>
-        <w:jc w:val="center"/>
-      </w:pPr>
-      <w:r>
-        <w:rPr>
-          <w:i/>
-          <w:color w:val="555555"/>
-          <w:sz w:val="19"/>
-        </w:rPr>
-        <w:t>Figure: Correct Conceptual Plot for Unique title.id (N=3000)</w:t>
-      </w:r>
-    </w:p>
-    <w:p>
-      <w:pPr>
+        <w:spacing w:before="160" w:after="160"/>
         <w:jc w:val="center"/>
       </w:pPr>
       <w:r>
         <w:drawing>
           <wp:inline xmlns:a="http://schemas.openxmlformats.org/drawingml/2006/main" xmlns:pic="http://schemas.openxmlformats.org/drawingml/2006/picture">
-            <wp:extent cx="5303520" cy="3374967"/>
+            <wp:extent cx="5029200" cy="3200400"/>
             <wp:docPr id="4" name="Picture 4"/>
             <wp:cNvGraphicFramePr>
               <a:graphicFrameLocks noChangeAspect="1"/>
@@ -13808,7 +13773,7 @@
                   <pic:spPr>
                     <a:xfrm>
                       <a:off x="0" y="0"/>
-                      <a:ext cx="5303520" cy="3374967"/>
+                      <a:ext cx="5029200" cy="3200400"/>
                     </a:xfrm>
                     <a:prstGeom prst="rect"/>
                   </pic:spPr>
@@ -13817,19 +13782,6 @@
             </a:graphic>
           </wp:inline>
         </w:drawing>
-      </w:r>
-    </w:p>
-    <w:p>
-      <w:pPr>
-        <w:jc w:val="center"/>
-      </w:pPr>
-      <w:r>
-        <w:rPr>
-          <w:i/>
-          <w:color w:val="555555"/>
-          <w:sz w:val="19"/>
-        </w:rPr>
-        <w:t>Figure: Q2: For title.title (N=3000) - Correct V-Optimal Serial Histogram</w:t>
       </w:r>
     </w:p>
     <w:p>
@@ -13855,7 +13807,7 @@
           <w:rFonts w:ascii="Calibri" w:hAnsi="Calibri"/>
           <w:sz w:val="22"/>
         </w:rPr>
-        <w:t>- Average Build Time for N=3000: 0.2118 seconds (id column) / 0.3122 seconds (title column)</w:t>
+        <w:t>- Average Build Time for N=3000: 0.0015 seconds (id column) / 0.0041 seconds (title column)</w:t>
       </w:r>
     </w:p>
     <w:p>
@@ -16983,12 +16935,13 @@
     </w:p>
     <w:p>
       <w:pPr>
+        <w:spacing w:before="160" w:after="160"/>
         <w:jc w:val="center"/>
       </w:pPr>
       <w:r>
         <w:drawing>
           <wp:inline xmlns:a="http://schemas.openxmlformats.org/drawingml/2006/main" xmlns:pic="http://schemas.openxmlformats.org/drawingml/2006/picture">
-            <wp:extent cx="5303520" cy="3535680"/>
+            <wp:extent cx="5029200" cy="3352800"/>
             <wp:docPr id="5" name="Picture 5"/>
             <wp:cNvGraphicFramePr>
               <a:graphicFrameLocks noChangeAspect="1"/>
@@ -17009,7 +16962,7 @@
                   <pic:spPr>
                     <a:xfrm>
                       <a:off x="0" y="0"/>
-                      <a:ext cx="5303520" cy="3535680"/>
+                      <a:ext cx="5029200" cy="3352800"/>
                     </a:xfrm>
                     <a:prstGeom prst="rect"/>
                   </pic:spPr>
@@ -17022,25 +16975,13 @@
     </w:p>
     <w:p>
       <w:pPr>
-        <w:jc w:val="center"/>
-      </w:pPr>
-      <w:r>
-        <w:rPr>
-          <w:i/>
-          <w:color w:val="555555"/>
-          <w:sz w:val="19"/>
-        </w:rPr>
-        <w:t>Figure: Sample Size: N=1000, title.id Serial Hist.</w:t>
-      </w:r>
-    </w:p>
-    <w:p>
-      <w:pPr>
+        <w:spacing w:before="160" w:after="160"/>
         <w:jc w:val="center"/>
       </w:pPr>
       <w:r>
         <w:drawing>
           <wp:inline xmlns:a="http://schemas.openxmlformats.org/drawingml/2006/main" xmlns:pic="http://schemas.openxmlformats.org/drawingml/2006/picture">
-            <wp:extent cx="5303520" cy="3374967"/>
+            <wp:extent cx="5029200" cy="3200400"/>
             <wp:docPr id="6" name="Picture 6"/>
             <wp:cNvGraphicFramePr>
               <a:graphicFrameLocks noChangeAspect="1"/>
@@ -17061,7 +17002,7 @@
                   <pic:spPr>
                     <a:xfrm>
                       <a:off x="0" y="0"/>
-                      <a:ext cx="5303520" cy="3374967"/>
+                      <a:ext cx="5029200" cy="3200400"/>
                     </a:xfrm>
                     <a:prstGeom prst="rect"/>
                   </pic:spPr>
@@ -17070,19 +17011,6 @@
             </a:graphic>
           </wp:inline>
         </w:drawing>
-      </w:r>
-    </w:p>
-    <w:p>
-      <w:pPr>
-        <w:jc w:val="center"/>
-      </w:pPr>
-      <w:r>
-        <w:rPr>
-          <w:i/>
-          <w:color w:val="555555"/>
-          <w:sz w:val="19"/>
-        </w:rPr>
-        <w:t>Figure: Sample Size: N=1000, title.title Serial Hist.</w:t>
       </w:r>
     </w:p>
     <w:p>
@@ -17100,12 +17028,13 @@
     </w:p>
     <w:p>
       <w:pPr>
+        <w:spacing w:before="160" w:after="160"/>
         <w:jc w:val="center"/>
       </w:pPr>
       <w:r>
         <w:drawing>
           <wp:inline xmlns:a="http://schemas.openxmlformats.org/drawingml/2006/main" xmlns:pic="http://schemas.openxmlformats.org/drawingml/2006/picture">
-            <wp:extent cx="5303520" cy="3535680"/>
+            <wp:extent cx="5029200" cy="3352800"/>
             <wp:docPr id="7" name="Picture 7"/>
             <wp:cNvGraphicFramePr>
               <a:graphicFrameLocks noChangeAspect="1"/>
@@ -17126,7 +17055,7 @@
                   <pic:spPr>
                     <a:xfrm>
                       <a:off x="0" y="0"/>
-                      <a:ext cx="5303520" cy="3535680"/>
+                      <a:ext cx="5029200" cy="3352800"/>
                     </a:xfrm>
                     <a:prstGeom prst="rect"/>
                   </pic:spPr>
@@ -17139,25 +17068,13 @@
     </w:p>
     <w:p>
       <w:pPr>
-        <w:jc w:val="center"/>
-      </w:pPr>
-      <w:r>
-        <w:rPr>
-          <w:i/>
-          <w:color w:val="555555"/>
-          <w:sz w:val="19"/>
-        </w:rPr>
-        <w:t>Figure: Correct Conceptual Plot for Unique title.id (N=3000)</w:t>
-      </w:r>
-    </w:p>
-    <w:p>
-      <w:pPr>
+        <w:spacing w:before="160" w:after="160"/>
         <w:jc w:val="center"/>
       </w:pPr>
       <w:r>
         <w:drawing>
           <wp:inline xmlns:a="http://schemas.openxmlformats.org/drawingml/2006/main" xmlns:pic="http://schemas.openxmlformats.org/drawingml/2006/picture">
-            <wp:extent cx="5303520" cy="3374967"/>
+            <wp:extent cx="5029200" cy="3200400"/>
             <wp:docPr id="8" name="Picture 8"/>
             <wp:cNvGraphicFramePr>
               <a:graphicFrameLocks noChangeAspect="1"/>
@@ -17178,7 +17095,7 @@
                   <pic:spPr>
                     <a:xfrm>
                       <a:off x="0" y="0"/>
-                      <a:ext cx="5303520" cy="3374967"/>
+                      <a:ext cx="5029200" cy="3200400"/>
                     </a:xfrm>
                     <a:prstGeom prst="rect"/>
                   </pic:spPr>
@@ -17187,19 +17104,6 @@
             </a:graphic>
           </wp:inline>
         </w:drawing>
-      </w:r>
-    </w:p>
-    <w:p>
-      <w:pPr>
-        <w:jc w:val="center"/>
-      </w:pPr>
-      <w:r>
-        <w:rPr>
-          <w:i/>
-          <w:color w:val="555555"/>
-          <w:sz w:val="19"/>
-        </w:rPr>
-        <w:t>Figure: Q2: For title.title (N=3000) - Correct V-Optimal Serial Histogram</w:t>
       </w:r>
     </w:p>
     <w:p>
@@ -17217,12 +17121,13 @@
     </w:p>
     <w:p>
       <w:pPr>
+        <w:spacing w:before="160" w:after="160"/>
         <w:jc w:val="center"/>
       </w:pPr>
       <w:r>
         <w:drawing>
           <wp:inline xmlns:a="http://schemas.openxmlformats.org/drawingml/2006/main" xmlns:pic="http://schemas.openxmlformats.org/drawingml/2006/picture">
-            <wp:extent cx="5303520" cy="3535680"/>
+            <wp:extent cx="5029200" cy="3352800"/>
             <wp:docPr id="9" name="Picture 9"/>
             <wp:cNvGraphicFramePr>
               <a:graphicFrameLocks noChangeAspect="1"/>
@@ -17243,7 +17148,7 @@
                   <pic:spPr>
                     <a:xfrm>
                       <a:off x="0" y="0"/>
-                      <a:ext cx="5303520" cy="3535680"/>
+                      <a:ext cx="5029200" cy="3352800"/>
                     </a:xfrm>
                     <a:prstGeom prst="rect"/>
                   </pic:spPr>
@@ -17256,25 +17161,13 @@
     </w:p>
     <w:p>
       <w:pPr>
-        <w:jc w:val="center"/>
-      </w:pPr>
-      <w:r>
-        <w:rPr>
-          <w:i/>
-          <w:color w:val="555555"/>
-          <w:sz w:val="19"/>
-        </w:rPr>
-        <w:t>Figure: Sample Size: N=5000, title.id Serial Hist.</w:t>
-      </w:r>
-    </w:p>
-    <w:p>
-      <w:pPr>
+        <w:spacing w:before="160" w:after="160"/>
         <w:jc w:val="center"/>
       </w:pPr>
       <w:r>
         <w:drawing>
           <wp:inline xmlns:a="http://schemas.openxmlformats.org/drawingml/2006/main" xmlns:pic="http://schemas.openxmlformats.org/drawingml/2006/picture">
-            <wp:extent cx="5303520" cy="3374967"/>
+            <wp:extent cx="5029200" cy="3200400"/>
             <wp:docPr id="10" name="Picture 10"/>
             <wp:cNvGraphicFramePr>
               <a:graphicFrameLocks noChangeAspect="1"/>
@@ -17295,7 +17188,7 @@
                   <pic:spPr>
                     <a:xfrm>
                       <a:off x="0" y="0"/>
-                      <a:ext cx="5303520" cy="3374967"/>
+                      <a:ext cx="5029200" cy="3200400"/>
                     </a:xfrm>
                     <a:prstGeom prst="rect"/>
                   </pic:spPr>
@@ -17304,19 +17197,6 @@
             </a:graphic>
           </wp:inline>
         </w:drawing>
-      </w:r>
-    </w:p>
-    <w:p>
-      <w:pPr>
-        <w:jc w:val="center"/>
-      </w:pPr>
-      <w:r>
-        <w:rPr>
-          <w:i/>
-          <w:color w:val="555555"/>
-          <w:sz w:val="19"/>
-        </w:rPr>
-        <w:t>Figure: Sample Size: N=5000, title.title Serial Hist.</w:t>
       </w:r>
     </w:p>
     <w:p>
@@ -17605,7 +17485,7 @@
                 <w:rFonts w:ascii="Calibri" w:hAnsi="Calibri"/>
                 <w:sz w:val="18"/>
               </w:rPr>
-              <w:t>0.2370s</w:t>
+              <w:t>0.0005s</w:t>
             </w:r>
           </w:p>
         </w:tc>
@@ -17733,7 +17613,7 @@
                 <w:rFonts w:ascii="Calibri" w:hAnsi="Calibri"/>
                 <w:sz w:val="18"/>
               </w:rPr>
-              <w:t>0.3204s</w:t>
+              <w:t>0.0012s</w:t>
             </w:r>
           </w:p>
         </w:tc>
@@ -17861,7 +17741,7 @@
                 <w:rFonts w:ascii="Calibri" w:hAnsi="Calibri"/>
                 <w:sz w:val="18"/>
               </w:rPr>
-              <w:t>0.2118s</w:t>
+              <w:t>0.0015s</w:t>
             </w:r>
           </w:p>
         </w:tc>
@@ -17989,7 +17869,7 @@
                 <w:rFonts w:ascii="Calibri" w:hAnsi="Calibri"/>
                 <w:sz w:val="18"/>
               </w:rPr>
-              <w:t>0.3122s</w:t>
+              <w:t>0.0041s</w:t>
             </w:r>
           </w:p>
         </w:tc>
@@ -18117,7 +17997,7 @@
                 <w:rFonts w:ascii="Calibri" w:hAnsi="Calibri"/>
                 <w:sz w:val="18"/>
               </w:rPr>
-              <w:t>0.2394s</w:t>
+              <w:t>0.0027s</w:t>
             </w:r>
           </w:p>
         </w:tc>
@@ -18245,7 +18125,7 @@
                 <w:rFonts w:ascii="Calibri" w:hAnsi="Calibri"/>
                 <w:sz w:val="18"/>
               </w:rPr>
-              <w:t>0.3256s</w:t>
+              <w:t>0.0078s</w:t>
             </w:r>
           </w:p>
         </w:tc>
@@ -18328,7 +18208,7 @@
           <w:rFonts w:ascii="Calibri" w:hAnsi="Calibri"/>
           <w:sz w:val="22"/>
         </w:rPr>
-        <w:t>- Point 1: (N_1, T_1) = (1000, 0.2370)</w:t>
+        <w:t>- Point 1: (N_1, T_1) = (1000, 0.0005)</w:t>
       </w:r>
     </w:p>
     <w:p>
@@ -18340,7 +18220,7 @@
           <w:rFonts w:ascii="Calibri" w:hAnsi="Calibri"/>
           <w:sz w:val="22"/>
         </w:rPr>
-        <w:t>- Point 2: (N_2, T_2) = (3000, 0.2118)</w:t>
+        <w:t>- Point 2: (N_2, T_2) = (3000, 0.0015)</w:t>
       </w:r>
     </w:p>
     <w:p>
@@ -18352,7 +18232,7 @@
           <w:rFonts w:ascii="Calibri" w:hAnsi="Calibri"/>
           <w:sz w:val="22"/>
         </w:rPr>
-        <w:t>- Point 3: (N_3, T_3) = (5000, 0.2394)</w:t>
+        <w:t>- Point 3: (N_3, T_3) = (5000, 0.0027)</w:t>
       </w:r>
     </w:p>
     <w:p>
@@ -18389,7 +18269,7 @@
           <w:rFonts w:ascii="Calibri" w:hAnsi="Calibri"/>
           <w:sz w:val="22"/>
         </w:rPr>
-        <w:t>- bar{T} = frac{0.2370 + 0.2118 + 0.2394}{3} = mathbf{0.2294text{ seconds}}</w:t>
+        <w:t>- bar{T} = frac{0.0005 + 0.0015 + 0.0027}{3} = mathbf{0.0016text{ seconds}}</w:t>
       </w:r>
     </w:p>
     <w:p>
@@ -18568,7 +18448,7 @@
                 <w:rFonts w:ascii="Calibri" w:hAnsi="Calibri"/>
                 <w:sz w:val="18"/>
               </w:rPr>
-              <w:t>0.2370</w:t>
+              <w:t>0.0005</w:t>
             </w:r>
           </w:p>
         </w:tc>
@@ -18604,7 +18484,7 @@
                 <w:rFonts w:ascii="Calibri" w:hAnsi="Calibri"/>
                 <w:sz w:val="18"/>
               </w:rPr>
-              <w:t>0.0076</w:t>
+              <w:t>-0.0010</w:t>
             </w:r>
           </w:p>
         </w:tc>
@@ -18640,7 +18520,7 @@
                 <w:rFonts w:ascii="Calibri" w:hAnsi="Calibri"/>
                 <w:sz w:val="18"/>
               </w:rPr>
-              <w:t>-15.2143</w:t>
+              <w:t>2.0964</w:t>
             </w:r>
           </w:p>
         </w:tc>
@@ -18678,7 +18558,7 @@
                 <w:rFonts w:ascii="Calibri" w:hAnsi="Calibri"/>
                 <w:sz w:val="18"/>
               </w:rPr>
-              <w:t>0.2118</w:t>
+              <w:t>0.0015</w:t>
             </w:r>
           </w:p>
         </w:tc>
@@ -18714,7 +18594,7 @@
                 <w:rFonts w:ascii="Calibri" w:hAnsi="Calibri"/>
                 <w:sz w:val="18"/>
               </w:rPr>
-              <w:t>-0.0176</w:t>
+              <w:t>-0.0001</w:t>
             </w:r>
           </w:p>
         </w:tc>
@@ -18788,7 +18668,7 @@
                 <w:rFonts w:ascii="Calibri" w:hAnsi="Calibri"/>
                 <w:sz w:val="18"/>
               </w:rPr>
-              <w:t>0.2394</w:t>
+              <w:t>0.0027</w:t>
             </w:r>
           </w:p>
         </w:tc>
@@ -18824,7 +18704,7 @@
                 <w:rFonts w:ascii="Calibri" w:hAnsi="Calibri"/>
                 <w:sz w:val="18"/>
               </w:rPr>
-              <w:t>0.0100</w:t>
+              <w:t>0.0011</w:t>
             </w:r>
           </w:p>
         </w:tc>
@@ -18860,7 +18740,7 @@
                 <w:rFonts w:ascii="Calibri" w:hAnsi="Calibri"/>
                 <w:sz w:val="18"/>
               </w:rPr>
-              <w:t>20.0143</w:t>
+              <w:t>2.2668</w:t>
             </w:r>
           </w:p>
         </w:tc>
@@ -18967,7 +18847,7 @@
                 <w:rFonts w:ascii="Calibri" w:hAnsi="Calibri"/>
                 <w:sz w:val="18"/>
               </w:rPr>
-              <w:t>4.8000</w:t>
+              <w:t>4.3632</w:t>
             </w:r>
           </w:p>
         </w:tc>
@@ -19012,7 +18892,7 @@
           <w:rFonts w:ascii="Calibri" w:hAnsi="Calibri"/>
           <w:sz w:val="22"/>
         </w:rPr>
-        <w:t>m = frac{sum (N_i - bar{N})(T_i - bar{T})}{sum (N_i - bar{N})^2} = frac{4.8000}{8,000,000} = mathbf{0.00000060text{ seconds / sample}}</w:t>
+        <w:t>m = frac{sum (N_i - bar{N})(T_i - bar{T})}{sum (N_i - bar{N})^2} = frac{4.3632}{8,000,000} = mathbf{0.00000055text{ seconds / sample}}</w:t>
       </w:r>
     </w:p>
     <w:p>
@@ -19036,7 +18916,7 @@
           <w:rFonts w:ascii="Calibri" w:hAnsi="Calibri"/>
           <w:sz w:val="22"/>
         </w:rPr>
-        <w:t>c = bar{T} - m cdot bar{N} = 0.2294 - (0.00000060 times 3000) = mathbf{0.227576text{ seconds}}</w:t>
+        <w:t>c = bar{T} - m cdot bar{N} = 0.0016 - (0.00000055 times 3000) = mathbf{-0.000056text{ seconds}}</w:t>
       </w:r>
     </w:p>
     <w:p>
@@ -19061,7 +18941,7 @@
           <w:rFonts w:ascii="Calibri" w:hAnsi="Calibri"/>
           <w:sz w:val="22"/>
         </w:rPr>
-        <w:t>T(2,528,312) = (0.00000060 times 2,528,312) + (0.227576) = mathbf{1.74text{ seconds}} quad (mathbf{0.03text{ minutes}})</w:t>
+        <w:t>T(2,528,312) = (0.00000055 times 2,528,312) + (-0.000056) = mathbf{1.38text{ seconds}} quad (mathbf{0.02text{ minutes}})</w:t>
       </w:r>
     </w:p>
     <w:p>
@@ -19092,12 +18972,13 @@
     </w:p>
     <w:p>
       <w:pPr>
+        <w:spacing w:before="160" w:after="160"/>
         <w:jc w:val="center"/>
       </w:pPr>
       <w:r>
         <w:drawing>
           <wp:inline xmlns:a="http://schemas.openxmlformats.org/drawingml/2006/main" xmlns:pic="http://schemas.openxmlformats.org/drawingml/2006/picture">
-            <wp:extent cx="5303520" cy="3314700"/>
+            <wp:extent cx="5029200" cy="3143250"/>
             <wp:docPr id="11" name="Picture 11"/>
             <wp:cNvGraphicFramePr>
               <a:graphicFrameLocks noChangeAspect="1"/>
@@ -19118,7 +18999,7 @@
                   <pic:spPr>
                     <a:xfrm>
                       <a:off x="0" y="0"/>
-                      <a:ext cx="5303520" cy="3314700"/>
+                      <a:ext cx="5029200" cy="3143250"/>
                     </a:xfrm>
                     <a:prstGeom prst="rect"/>
                   </pic:spPr>
@@ -19127,19 +19008,6 @@
             </a:graphic>
           </wp:inline>
         </w:drawing>
-      </w:r>
-    </w:p>
-    <w:p>
-      <w:pPr>
-        <w:jc w:val="center"/>
-      </w:pPr>
-      <w:r>
-        <w:rPr>
-          <w:i/>
-          <w:color w:val="555555"/>
-          <w:sz w:val="19"/>
-        </w:rPr>
-        <w:t>Figure: Sample Size vs Time</w:t>
       </w:r>
     </w:p>
     <w:p>
@@ -19170,12 +19038,13 @@
     </w:p>
     <w:p>
       <w:pPr>
+        <w:spacing w:before="160" w:after="160"/>
         <w:jc w:val="center"/>
       </w:pPr>
       <w:r>
         <w:drawing>
           <wp:inline xmlns:a="http://schemas.openxmlformats.org/drawingml/2006/main" xmlns:pic="http://schemas.openxmlformats.org/drawingml/2006/picture">
-            <wp:extent cx="5303520" cy="3314700"/>
+            <wp:extent cx="5029200" cy="3143250"/>
             <wp:docPr id="12" name="Picture 12"/>
             <wp:cNvGraphicFramePr>
               <a:graphicFrameLocks noChangeAspect="1"/>
@@ -19196,7 +19065,7 @@
                   <pic:spPr>
                     <a:xfrm>
                       <a:off x="0" y="0"/>
-                      <a:ext cx="5303520" cy="3314700"/>
+                      <a:ext cx="5029200" cy="3143250"/>
                     </a:xfrm>
                     <a:prstGeom prst="rect"/>
                   </pic:spPr>
@@ -19205,19 +19074,6 @@
             </a:graphic>
           </wp:inline>
         </w:drawing>
-      </w:r>
-    </w:p>
-    <w:p>
-      <w:pPr>
-        <w:jc w:val="center"/>
-      </w:pPr>
-      <w:r>
-        <w:rPr>
-          <w:i/>
-          <w:color w:val="555555"/>
-          <w:sz w:val="19"/>
-        </w:rPr>
-        <w:t>Figure: Sample Size vs Max Selectivity Error</w:t>
       </w:r>
     </w:p>
     <w:p>

</xml_diff>